<commit_message>
Updating System Tuning doc to report which version of Ubuntu work
</commit_message>
<xml_diff>
--- a/TR-017_System_Tuning.docx
+++ b/TR-017_System_Tuning.docx
@@ -338,6 +338,61 @@
         <w:pStyle w:val="Heading1"/>
       </w:pPr>
       <w:r>
+        <w:t>Supported operating systems and windowing systems</w:t>
+      </w:r>
+    </w:p>
+    <w:p>
+      <w:r>
+        <w:t xml:space="preserve">The Render Module code uses the GLFW library in an off-specification manner by putting window creation and event detection in threads other than the main thread. This works under </w:t>
+      </w:r>
+      <w:r>
+        <w:rPr>
+          <w:b/>
+          <w:bCs/>
+          <w:i/>
+          <w:iCs/>
+        </w:rPr>
+        <w:t>Windows 11</w:t>
+      </w:r>
+      <w:r>
+        <w:t xml:space="preserve"> and under </w:t>
+      </w:r>
+      <w:r>
+        <w:rPr>
+          <w:b/>
+          <w:bCs/>
+          <w:i/>
+          <w:iCs/>
+        </w:rPr>
+        <w:t>Ubuntu 22.04 and 24.04 using X11</w:t>
+      </w:r>
+      <w:r>
+        <w:t xml:space="preserve"> but does not work under </w:t>
+      </w:r>
+      <w:r>
+        <w:t>(for example)</w:t>
+      </w:r>
+      <w:r>
+        <w:t xml:space="preserve"> Wayland</w:t>
+      </w:r>
+      <w:r>
+        <w:t xml:space="preserve"> or</w:t>
+      </w:r>
+      <w:r>
+        <w:t xml:space="preserve"> Ubuntu 26.04 or</w:t>
+      </w:r>
+      <w:r>
+        <w:t xml:space="preserve"> MacOS</w:t>
+      </w:r>
+      <w:r>
+        <w:t>.</w:t>
+      </w:r>
+    </w:p>
+    <w:p>
+      <w:pPr>
+        <w:pStyle w:val="Heading1"/>
+      </w:pPr>
+      <w:r>
         <w:t>Build in Release mode</w:t>
       </w:r>
     </w:p>
@@ -348,6 +403,7 @@
     </w:p>
     <w:p>
       <w:r>
+        <w:lastRenderedPageBreak/>
         <w:t xml:space="preserve">All repositories should be compiled with </w:t>
       </w:r>
       <w:r>
@@ -366,7 +422,6 @@
         <w:pStyle w:val="Heading1"/>
       </w:pPr>
       <w:r>
-        <w:lastRenderedPageBreak/>
         <w:t>BIOS update</w:t>
       </w:r>
       <w:r>
@@ -817,6 +872,7 @@
     </w:p>
     <w:p>
       <w:r>
+        <w:lastRenderedPageBreak/>
         <w:t xml:space="preserve">To make the IR camera inputs synchronized to the displays, minimizing latency over all frames, we’ll plan to </w:t>
       </w:r>
       <w:r>
@@ -867,7 +923,6 @@
     </w:p>
     <w:p>
       <w:r>
-        <w:lastRenderedPageBreak/>
         <w:t xml:space="preserve">When using the </w:t>
       </w:r>
       <w:r>
@@ -1395,6 +1450,7 @@
           <w:b/>
           <w:bCs/>
         </w:rPr>
+        <w:lastRenderedPageBreak/>
         <w:t>TRIM:</w:t>
       </w:r>
       <w:r>
@@ -1424,11 +1480,7 @@
         <w:t>should not</w:t>
       </w:r>
       <w:r>
-        <w:t xml:space="preserve"> be </w:t>
-      </w:r>
-      <w:r>
-        <w:lastRenderedPageBreak/>
-        <w:t xml:space="preserve">added to the </w:t>
+        <w:t xml:space="preserve"> be added to the </w:t>
       </w:r>
       <w:r>
         <w:rPr>
@@ -1733,6 +1785,7 @@
         </w:numPr>
       </w:pPr>
       <w:r>
+        <w:lastRenderedPageBreak/>
         <w:t>(not done) Use the CPU cores directly connected to the relevant PCIe bus where the Mellanox adapter is located.</w:t>
       </w:r>
     </w:p>
@@ -1757,7 +1810,6 @@
         </w:numPr>
       </w:pPr>
       <w:r>
-        <w:lastRenderedPageBreak/>
         <w:t xml:space="preserve">In </w:t>
       </w:r>
       <w:r>
@@ -3901,7 +3953,7 @@
       <w:t>2</w:t>
     </w:r>
     <w:r>
-      <w:t>4</w:t>
+      <w:t>5</w:t>
     </w:r>
     <w:r>
       <w:tab/>
@@ -3910,7 +3962,10 @@
       <w:tab/>
     </w:r>
     <w:r>
-      <w:t>9/2</w:t>
+      <w:t>9/</w:t>
+    </w:r>
+    <w:r>
+      <w:t>12</w:t>
     </w:r>
     <w:r>
       <w:t>/2026</w:t>

</xml_diff>

<commit_message>
Updating System Tuning to describe the OS and windowing systems that have been tested on.
</commit_message>
<xml_diff>
--- a/TR-017_System_Tuning.docx
+++ b/TR-017_System_Tuning.docx
@@ -343,7 +343,28 @@
     </w:p>
     <w:p>
       <w:r>
-        <w:t xml:space="preserve">The Render Module code uses the GLFW library in an off-specification manner by putting window creation and event detection in threads other than the main thread. This works under </w:t>
+        <w:t xml:space="preserve">Version 3.54 of </w:t>
+      </w:r>
+      <w:r>
+        <w:t>Render Module</w:t>
+      </w:r>
+      <w:r>
+        <w:t xml:space="preserve"> (the first version using GLAD rather than GLEW)</w:t>
+      </w:r>
+      <w:r>
+        <w:t xml:space="preserve"> </w:t>
+      </w:r>
+      <w:r>
+        <w:t>has been tested</w:t>
+      </w:r>
+      <w:r>
+        <w:t xml:space="preserve"> </w:t>
+      </w:r>
+      <w:r>
+        <w:t>on</w:t>
+      </w:r>
+      <w:r>
+        <w:t xml:space="preserve"> </w:t>
       </w:r>
       <w:r>
         <w:rPr>
@@ -355,34 +376,67 @@
         <w:t>Windows 11</w:t>
       </w:r>
       <w:r>
-        <w:t xml:space="preserve"> and under </w:t>
-      </w:r>
-      <w:r>
-        <w:rPr>
-          <w:b/>
-          <w:bCs/>
-          <w:i/>
-          <w:iCs/>
-        </w:rPr>
-        <w:t>Ubuntu 22.04 and 24.04 using X11</w:t>
-      </w:r>
-      <w:r>
-        <w:t xml:space="preserve"> but does not work under </w:t>
-      </w:r>
-      <w:r>
-        <w:t>(for example)</w:t>
-      </w:r>
-      <w:r>
-        <w:t xml:space="preserve"> Wayland</w:t>
-      </w:r>
-      <w:r>
-        <w:t xml:space="preserve"> or</w:t>
-      </w:r>
-      <w:r>
-        <w:t xml:space="preserve"> Ubuntu 26.04 or</w:t>
-      </w:r>
-      <w:r>
-        <w:t xml:space="preserve"> MacOS</w:t>
+        <w:t xml:space="preserve"> and </w:t>
+      </w:r>
+      <w:r>
+        <w:t>on</w:t>
+      </w:r>
+      <w:r>
+        <w:t xml:space="preserve"> </w:t>
+      </w:r>
+      <w:r>
+        <w:rPr>
+          <w:b/>
+          <w:bCs/>
+          <w:i/>
+          <w:iCs/>
+        </w:rPr>
+        <w:t xml:space="preserve">Ubuntu 22.04 </w:t>
+      </w:r>
+      <w:r>
+        <w:rPr>
+          <w:b/>
+          <w:bCs/>
+          <w:i/>
+          <w:iCs/>
+        </w:rPr>
+        <w:t xml:space="preserve">- </w:t>
+      </w:r>
+      <w:r>
+        <w:rPr>
+          <w:b/>
+          <w:bCs/>
+          <w:i/>
+          <w:iCs/>
+        </w:rPr>
+        <w:t>2</w:t>
+      </w:r>
+      <w:r>
+        <w:rPr>
+          <w:b/>
+          <w:bCs/>
+          <w:i/>
+          <w:iCs/>
+        </w:rPr>
+        <w:t>6</w:t>
+      </w:r>
+      <w:r>
+        <w:rPr>
+          <w:b/>
+          <w:bCs/>
+          <w:i/>
+          <w:iCs/>
+        </w:rPr>
+        <w:t>.04 using X1</w:t>
+      </w:r>
+      <w:r>
+        <w:rPr>
+          <w:b/>
+          <w:bCs/>
+          <w:i/>
+          <w:iCs/>
+        </w:rPr>
+        <w:t>1 or Wayland</w:t>
       </w:r>
       <w:r>
         <w:t>.</w:t>
@@ -3953,7 +4007,7 @@
       <w:t>2</w:t>
     </w:r>
     <w:r>
-      <w:t>5</w:t>
+      <w:t>6</w:t>
     </w:r>
     <w:r>
       <w:tab/>
@@ -3965,7 +4019,10 @@
       <w:t>9/</w:t>
     </w:r>
     <w:r>
-      <w:t>12</w:t>
+      <w:t>1</w:t>
+    </w:r>
+    <w:r>
+      <w:t>4</w:t>
     </w:r>
     <w:r>
       <w:t>/2026</w:t>

</xml_diff>

<commit_message>
Updating system tuning doc
</commit_message>
<xml_diff>
--- a/TR-017_System_Tuning.docx
+++ b/TR-017_System_Tuning.docx
@@ -105,7 +105,15 @@
         <w:t xml:space="preserve"> laptop with a </w:t>
       </w:r>
       <w:r>
-        <w:t>13th Gen Intel(R) Core(TM) i9-13900HX</w:t>
+        <w:t xml:space="preserve">13th Gen Intel(R) </w:t>
+      </w:r>
+      <w:proofErr w:type="gramStart"/>
+      <w:r>
+        <w:t>Core(</w:t>
+      </w:r>
+      <w:proofErr w:type="gramEnd"/>
+      <w:r>
+        <w:t>TM) i9-13900HX</w:t>
       </w:r>
       <w:r>
         <w:t xml:space="preserve">, 32GB of RAM, and an </w:t>
@@ -132,7 +140,15 @@
         <w:t>s</w:t>
       </w:r>
       <w:r>
-        <w:t xml:space="preserve"> the DisplayWindow to have focus and sometimes require</w:t>
+        <w:t xml:space="preserve"> the </w:t>
+      </w:r>
+      <w:proofErr w:type="spellStart"/>
+      <w:r>
+        <w:t>DisplayWindow</w:t>
+      </w:r>
+      <w:proofErr w:type="spellEnd"/>
+      <w:r>
+        <w:t xml:space="preserve"> to have focus and sometimes require</w:t>
       </w:r>
       <w:r>
         <w:t>s</w:t>
@@ -209,22 +225,54 @@
         <w:t>Storage Module</w:t>
       </w:r>
       <w:r>
-        <w:t xml:space="preserve"> at full rate locally writing to a Render Module at full rate from a 21-camera recording. This can display to the local display </w:t>
+        <w:t xml:space="preserve"> at full rate locally writing to a Render Module at full rate from a 21-camera recording. This can </w:t>
+      </w:r>
+      <w:proofErr w:type="gramStart"/>
+      <w:r>
+        <w:t>display</w:t>
+      </w:r>
+      <w:proofErr w:type="gramEnd"/>
+      <w:r>
+        <w:t xml:space="preserve"> to the local display </w:t>
       </w:r>
       <w:r>
         <w:t xml:space="preserve">and </w:t>
       </w:r>
       <w:r>
-        <w:t>to an Elbit XSight HMD.</w:t>
+        <w:t xml:space="preserve">to an Elbit </w:t>
+      </w:r>
+      <w:proofErr w:type="spellStart"/>
+      <w:r>
+        <w:t>XSight</w:t>
+      </w:r>
+      <w:proofErr w:type="spellEnd"/>
+      <w:r>
+        <w:t xml:space="preserve"> HMD.</w:t>
       </w:r>
       <w:r>
         <w:t xml:space="preserve"> This is much smaller and lighter than the deskside Render Server used as the primary development platform.</w:t>
       </w:r>
       <w:r>
-        <w:t xml:space="preserve"> It is also capable of doing depth estimation on a 25-camera system, but the speed of this is still being studied. Using these drives, it can store from a 21-camera live system at full rate until the drives are approximately halfway full; we’re still investigating the use of commercial-grade drives to enable full-speed storage to full drive capacity.</w:t>
-      </w:r>
-      <w:r>
-        <w:t xml:space="preserve"> Using an ATTO Technology ThunderLink NS 5102</w:t>
+        <w:t xml:space="preserve"> It is also capable of doing depth estimation on a 25-camera system, but the speed of this is still being studied. Using these drives, </w:t>
+      </w:r>
+      <w:proofErr w:type="gramStart"/>
+      <w:r>
+        <w:t>it</w:t>
+      </w:r>
+      <w:proofErr w:type="gramEnd"/>
+      <w:r>
+        <w:t xml:space="preserve"> can store from a 21-camera live system at full rate until the drives are approximately halfway full; we’re still investigating the use of commercial-grade drives to enable full-speed storage to full drive capacity.</w:t>
+      </w:r>
+      <w:r>
+        <w:t xml:space="preserve"> Using an ATTO Technology </w:t>
+      </w:r>
+      <w:proofErr w:type="spellStart"/>
+      <w:r>
+        <w:t>ThunderLink</w:t>
+      </w:r>
+      <w:proofErr w:type="spellEnd"/>
+      <w:r>
+        <w:t xml:space="preserve"> NS 5102</w:t>
       </w:r>
       <w:r>
         <w:t xml:space="preserve"> </w:t>
@@ -263,7 +311,15 @@
         <w:t xml:space="preserve">also </w:t>
       </w:r>
       <w:r>
-        <w:t>drive both a local display and an XSight.</w:t>
+        <w:t xml:space="preserve">drive both a local display and an </w:t>
+      </w:r>
+      <w:proofErr w:type="spellStart"/>
+      <w:r>
+        <w:t>XSight</w:t>
+      </w:r>
+      <w:proofErr w:type="spellEnd"/>
+      <w:r>
+        <w:t>.</w:t>
       </w:r>
     </w:p>
     <w:p>
@@ -282,7 +338,15 @@
         <w:t>Development desk-sides:</w:t>
       </w:r>
       <w:r>
-        <w:t xml:space="preserve"> The main development computers were large desk-side systems custom built for the project.</w:t>
+        <w:t xml:space="preserve"> The main </w:t>
+      </w:r>
+      <w:proofErr w:type="gramStart"/>
+      <w:r>
+        <w:t>development</w:t>
+      </w:r>
+      <w:proofErr w:type="gramEnd"/>
+      <w:r>
+        <w:t xml:space="preserve"> computers were large desk-side systems custom built for the project.</w:t>
       </w:r>
       <w:r>
         <w:t xml:space="preserve"> Both use a Mellanox PCI 100GigE network connector with two SFP modules.</w:t>
@@ -312,7 +376,15 @@
         <w:t xml:space="preserve"> </w:t>
       </w:r>
       <w:r>
-        <w:t>includes a PCI four 2-TB NVMe drive enclosure with commercial-grade cards, supporting up to half an hour of full-rate capture on a 21-camera ball.</w:t>
+        <w:t xml:space="preserve">includes a PCI four 2-TB </w:t>
+      </w:r>
+      <w:proofErr w:type="spellStart"/>
+      <w:r>
+        <w:t>NVMe</w:t>
+      </w:r>
+      <w:proofErr w:type="spellEnd"/>
+      <w:r>
+        <w:t xml:space="preserve"> drive enclosure with commercial-grade cards, supporting up to half an hour of full-rate capture on a 21-camera ball.</w:t>
       </w:r>
       <w:r>
         <w:t xml:space="preserve"> The </w:t>
@@ -447,17 +519,224 @@
         <w:pStyle w:val="Heading1"/>
       </w:pPr>
       <w:r>
+        <w:t>Working configurations</w:t>
+      </w:r>
+    </w:p>
+    <w:p>
+      <w:r>
+        <w:t>The following configurations were tested and working as of 9/16/2026:</w:t>
+      </w:r>
+    </w:p>
+    <w:p>
+      <w:pPr>
+        <w:pStyle w:val="ListParagraph"/>
+        <w:numPr>
+          <w:ilvl w:val="0"/>
+          <w:numId w:val="14"/>
+        </w:numPr>
+      </w:pPr>
+      <w:r>
+        <w:rPr>
+          <w:b/>
+          <w:bCs/>
+        </w:rPr>
+        <w:t>Varjo HMD:</w:t>
+      </w:r>
+      <w:r>
+        <w:t xml:space="preserve"> (Windows, </w:t>
+      </w:r>
+      <w:proofErr w:type="spellStart"/>
+      <w:r>
+        <w:t>OpenXR</w:t>
+      </w:r>
+      <w:proofErr w:type="spellEnd"/>
+      <w:r>
+        <w:t>) This works when connected to a live camera including stereo cameras when run with the camera connected to the Storage Server and the Render Server connected to the other port on the Storage Server. It does not work with the ball directly connected to the storage server. It does not work with replay from the Storage Server.</w:t>
+      </w:r>
+    </w:p>
+    <w:p>
+      <w:pPr>
+        <w:pStyle w:val="ListParagraph"/>
+        <w:numPr>
+          <w:ilvl w:val="0"/>
+          <w:numId w:val="14"/>
+        </w:numPr>
+      </w:pPr>
+      <w:r>
+        <w:rPr>
+          <w:b/>
+          <w:bCs/>
+        </w:rPr>
+        <w:lastRenderedPageBreak/>
+        <w:t>Render Server under Windows:</w:t>
+      </w:r>
+      <w:r>
+        <w:t xml:space="preserve"> This works in the same configuration</w:t>
+      </w:r>
+      <w:r>
+        <w:t>s</w:t>
+      </w:r>
+      <w:r>
+        <w:t xml:space="preserve"> described for the Varjo.</w:t>
+      </w:r>
+    </w:p>
+    <w:p>
+      <w:pPr>
+        <w:pStyle w:val="ListParagraph"/>
+        <w:numPr>
+          <w:ilvl w:val="0"/>
+          <w:numId w:val="14"/>
+        </w:numPr>
+      </w:pPr>
+      <w:r>
+        <w:rPr>
+          <w:b/>
+          <w:bCs/>
+        </w:rPr>
+        <w:t>Render Server under Linux:</w:t>
+      </w:r>
+      <w:r>
+        <w:t xml:space="preserve"> This works directly connected to the ball, including the use of stereo.</w:t>
+      </w:r>
+    </w:p>
+    <w:p>
+      <w:pPr>
+        <w:pStyle w:val="ListParagraph"/>
+        <w:numPr>
+          <w:ilvl w:val="0"/>
+          <w:numId w:val="14"/>
+        </w:numPr>
+      </w:pPr>
+      <w:r>
+        <w:rPr>
+          <w:b/>
+          <w:bCs/>
+        </w:rPr>
+        <w:t>Alienware laptop under Linux:</w:t>
+      </w:r>
+      <w:r>
+        <w:t xml:space="preserve"> This works with live or replay when connected to the Storage Server through a 500GigE connection; for live, the ball must be connected to the other port of the Storage Server at 100GigE (the only speed the ball runs at).</w:t>
+      </w:r>
+      <w:r>
+        <w:t xml:space="preserve"> </w:t>
+      </w:r>
+      <w:proofErr w:type="gramStart"/>
+      <w:r>
+        <w:rPr>
+          <w:b/>
+          <w:bCs/>
+          <w:i/>
+          <w:iCs/>
+        </w:rPr>
+        <w:t>@todo</w:t>
+      </w:r>
+      <w:proofErr w:type="gramEnd"/>
+      <w:r>
+        <w:rPr>
+          <w:b/>
+          <w:bCs/>
+          <w:i/>
+          <w:iCs/>
+        </w:rPr>
+        <w:t xml:space="preserve"> </w:t>
+      </w:r>
+      <w:proofErr w:type="gramStart"/>
+      <w:r>
+        <w:rPr>
+          <w:b/>
+          <w:bCs/>
+          <w:i/>
+          <w:iCs/>
+        </w:rPr>
+        <w:t>On</w:t>
+      </w:r>
+      <w:proofErr w:type="gramEnd"/>
+      <w:r>
+        <w:rPr>
+          <w:b/>
+          <w:bCs/>
+          <w:i/>
+          <w:iCs/>
+        </w:rPr>
+        <w:t xml:space="preserve"> 9/16, this was no longer working even wit</w:t>
+      </w:r>
+      <w:r>
+        <w:rPr>
+          <w:b/>
+          <w:bCs/>
+          <w:i/>
+          <w:iCs/>
+        </w:rPr>
+        <w:t>h --</w:t>
+      </w:r>
+      <w:proofErr w:type="spellStart"/>
+      <w:r>
+        <w:rPr>
+          <w:b/>
+          <w:bCs/>
+          <w:i/>
+          <w:iCs/>
+        </w:rPr>
+        <w:t>maxCameras</w:t>
+      </w:r>
+      <w:proofErr w:type="spellEnd"/>
+      <w:r>
+        <w:rPr>
+          <w:b/>
+          <w:bCs/>
+          <w:i/>
+          <w:iCs/>
+        </w:rPr>
+        <w:t xml:space="preserve"> 21.</w:t>
+      </w:r>
+    </w:p>
+    <w:p>
+      <w:pPr>
+        <w:pStyle w:val="Heading1"/>
+      </w:pPr>
+      <w:r>
         <w:t>Build in Release mode</w:t>
       </w:r>
     </w:p>
     <w:p>
       <w:r>
-        <w:t>When configuring CMake to build all repositories (ASDP_Core_API along with others), there is a very larger (factor of 10) difference in speeds between Debug and RelWithDebInfo modes and a smaller factor of improvement in speed between RelWithDebInfo and Release mode.</w:t>
-      </w:r>
-    </w:p>
-    <w:p>
-      <w:r>
-        <w:lastRenderedPageBreak/>
+        <w:t xml:space="preserve">When configuring </w:t>
+      </w:r>
+      <w:proofErr w:type="spellStart"/>
+      <w:r>
+        <w:t>CMake</w:t>
+      </w:r>
+      <w:proofErr w:type="spellEnd"/>
+      <w:r>
+        <w:t xml:space="preserve"> to build all repositories (</w:t>
+      </w:r>
+      <w:proofErr w:type="spellStart"/>
+      <w:r>
+        <w:t>ASDP_Core_API</w:t>
+      </w:r>
+      <w:proofErr w:type="spellEnd"/>
+      <w:r>
+        <w:t xml:space="preserve"> along with others), there is a very larger (factor of 10) difference in speeds between Debug and </w:t>
+      </w:r>
+      <w:proofErr w:type="spellStart"/>
+      <w:r>
+        <w:t>RelWithDebInfo</w:t>
+      </w:r>
+      <w:proofErr w:type="spellEnd"/>
+      <w:r>
+        <w:t xml:space="preserve"> modes and a smaller factor of improvement in speed between </w:t>
+      </w:r>
+      <w:proofErr w:type="spellStart"/>
+      <w:r>
+        <w:t>RelWithDebInfo</w:t>
+      </w:r>
+      <w:proofErr w:type="spellEnd"/>
+      <w:r>
+        <w:t xml:space="preserve"> and Release mode.</w:t>
+      </w:r>
+    </w:p>
+    <w:p>
+      <w:r>
         <w:t xml:space="preserve">All repositories should be compiled with </w:t>
       </w:r>
       <w:r>
@@ -468,7 +747,15 @@
         <w:t>CMAKE_BUILD_TYPE set to Release</w:t>
       </w:r>
       <w:r>
-        <w:t xml:space="preserve"> for codes that are going to be used for performance testing or actual use. Using RelWithDebInfo is useful when chasing down crashes or profiling, and Debug is useful when chasing deeper bugs where all local variables are needed.</w:t>
+        <w:t xml:space="preserve"> for codes that are going to be used for performance testing or actual use. Using </w:t>
+      </w:r>
+      <w:proofErr w:type="spellStart"/>
+      <w:r>
+        <w:t>RelWithDebInfo</w:t>
+      </w:r>
+      <w:proofErr w:type="spellEnd"/>
+      <w:r>
+        <w:t xml:space="preserve"> is useful when chasing down crashes or profiling, and Debug is useful when chasing deeper bugs where all local variables are needed.</w:t>
       </w:r>
     </w:p>
     <w:p>
@@ -512,7 +799,15 @@
         <w:t>Windows BIOS updater</w:t>
       </w:r>
       <w:r>
-        <w:t xml:space="preserve"> built into the MyASUS app</w:t>
+        <w:t xml:space="preserve"> built into the </w:t>
+      </w:r>
+      <w:proofErr w:type="spellStart"/>
+      <w:r>
+        <w:t>MyASUS</w:t>
+      </w:r>
+      <w:proofErr w:type="spellEnd"/>
+      <w:r>
+        <w:t xml:space="preserve"> app</w:t>
       </w:r>
       <w:r>
         <w:t xml:space="preserve"> from the Microsoft store</w:t>
@@ -659,13 +954,34 @@
         </w:numPr>
       </w:pPr>
       <w:r>
-        <w:t xml:space="preserve">For the Alienware laptop Render Server when it has internal NVMe drives that will run the storage module, as of 1/21/2016 you must enable the </w:t>
+        <w:t xml:space="preserve">For the Alienware laptop Render </w:t>
+      </w:r>
+      <w:proofErr w:type="gramStart"/>
+      <w:r>
+        <w:t>Server</w:t>
+      </w:r>
+      <w:proofErr w:type="gramEnd"/>
+      <w:r>
+        <w:t xml:space="preserve"> when it has internal </w:t>
+      </w:r>
+      <w:proofErr w:type="spellStart"/>
+      <w:r>
+        <w:t>NVMe</w:t>
+      </w:r>
+      <w:proofErr w:type="spellEnd"/>
+      <w:r>
+        <w:t xml:space="preserve"> drives that will run the storage module, as of 1/21/2016 you must enable the </w:t>
       </w:r>
       <w:r>
         <w:t xml:space="preserve">native </w:t>
       </w:r>
-      <w:r>
-        <w:t>NVMe driver</w:t>
+      <w:proofErr w:type="spellStart"/>
+      <w:r>
+        <w:t>NVMe</w:t>
+      </w:r>
+      <w:proofErr w:type="spellEnd"/>
+      <w:r>
+        <w:t xml:space="preserve"> driver</w:t>
       </w:r>
       <w:r>
         <w:t xml:space="preserve">. The </w:t>
@@ -836,17 +1152,36 @@
       <w:r>
         <w:t xml:space="preserve"> For the Alienware laptop Render Server to have wired networking: </w:t>
       </w:r>
-      <w:r>
-        <w:rPr>
-          <w:b/>
-          <w:bCs/>
-          <w:i/>
-          <w:iCs/>
-        </w:rPr>
-        <w:t>sudo apt install r8125-dkms</w:t>
-      </w:r>
-      <w:r>
-        <w:t xml:space="preserve"> (needed driver). For the GeForce 5090 card in the Alienware laptop, only the nVidia drivers with the name </w:t>
+      <w:proofErr w:type="spellStart"/>
+      <w:r>
+        <w:rPr>
+          <w:b/>
+          <w:bCs/>
+          <w:i/>
+          <w:iCs/>
+        </w:rPr>
+        <w:t>sudo</w:t>
+      </w:r>
+      <w:proofErr w:type="spellEnd"/>
+      <w:r>
+        <w:rPr>
+          <w:b/>
+          <w:bCs/>
+          <w:i/>
+          <w:iCs/>
+        </w:rPr>
+        <w:t xml:space="preserve"> apt install r8125-dkms</w:t>
+      </w:r>
+      <w:r>
+        <w:t xml:space="preserve"> (needed driver). For the GeForce 5090 card in the Alienware laptop, only the </w:t>
+      </w:r>
+      <w:proofErr w:type="spellStart"/>
+      <w:r>
+        <w:t>nVidia</w:t>
+      </w:r>
+      <w:proofErr w:type="spellEnd"/>
+      <w:r>
+        <w:t xml:space="preserve"> drivers with the name </w:t>
       </w:r>
       <w:r>
         <w:rPr>
@@ -867,6 +1202,7 @@
         <w:pStyle w:val="Heading1"/>
       </w:pPr>
       <w:r>
+        <w:lastRenderedPageBreak/>
         <w:t>Application priority tuning</w:t>
       </w:r>
     </w:p>
@@ -887,7 +1223,39 @@
           <w:i/>
           <w:iCs/>
         </w:rPr>
-        <w:t>start "" /high "C:\Program Files (x86)\ASDP_Render_Module\bin\ASDP_Render_Module.exe" [command line arguments]</w:t>
+        <w:t>start "" /high "C:\Program Files (x</w:t>
+      </w:r>
+      <w:proofErr w:type="gramStart"/>
+      <w:r>
+        <w:rPr>
+          <w:i/>
+          <w:iCs/>
+        </w:rPr>
+        <w:t>86)\</w:t>
+      </w:r>
+      <w:proofErr w:type="spellStart"/>
+      <w:r>
+        <w:rPr>
+          <w:i/>
+          <w:iCs/>
+        </w:rPr>
+        <w:t>ASDP_Render_Module</w:t>
+      </w:r>
+      <w:proofErr w:type="spellEnd"/>
+      <w:r>
+        <w:rPr>
+          <w:i/>
+          <w:iCs/>
+        </w:rPr>
+        <w:t>\bin\ASDP_Render_Module.exe</w:t>
+      </w:r>
+      <w:proofErr w:type="gramEnd"/>
+      <w:r>
+        <w:rPr>
+          <w:i/>
+          <w:iCs/>
+        </w:rPr>
+        <w:t>" [command line arguments]</w:t>
       </w:r>
     </w:p>
     <w:p>
@@ -915,7 +1283,15 @@
     </w:p>
     <w:p>
       <w:r>
-        <w:t xml:space="preserve">When driving one particular HD display, Linux </w:t>
+        <w:t xml:space="preserve">When driving one </w:t>
+      </w:r>
+      <w:proofErr w:type="gramStart"/>
+      <w:r>
+        <w:t>particular HD</w:t>
+      </w:r>
+      <w:proofErr w:type="gramEnd"/>
+      <w:r>
+        <w:t xml:space="preserve"> display, Linux </w:t>
       </w:r>
       <w:r>
         <w:t xml:space="preserve">can </w:t>
@@ -926,7 +1302,6 @@
     </w:p>
     <w:p>
       <w:r>
-        <w:lastRenderedPageBreak/>
         <w:t xml:space="preserve">To make the IR camera inputs synchronized to the displays, minimizing latency over all frames, we’ll plan to </w:t>
       </w:r>
       <w:r>
@@ -1044,7 +1419,15 @@
         </w:numPr>
       </w:pPr>
       <w:r>
-        <w:t xml:space="preserve">In the nVidia control panel under </w:t>
+        <w:t xml:space="preserve">In the </w:t>
+      </w:r>
+      <w:proofErr w:type="spellStart"/>
+      <w:r>
+        <w:t>nVidia</w:t>
+      </w:r>
+      <w:proofErr w:type="spellEnd"/>
+      <w:r>
+        <w:t xml:space="preserve"> control panel under </w:t>
       </w:r>
       <w:r>
         <w:rPr>
@@ -1096,7 +1479,15 @@
         </w:numPr>
       </w:pPr>
       <w:r>
-        <w:t xml:space="preserve">In the nVidia control panel under </w:t>
+        <w:t xml:space="preserve">In the </w:t>
+      </w:r>
+      <w:proofErr w:type="spellStart"/>
+      <w:r>
+        <w:t>nVidia</w:t>
+      </w:r>
+      <w:proofErr w:type="spellEnd"/>
+      <w:r>
+        <w:t xml:space="preserve"> control panel under </w:t>
       </w:r>
       <w:r>
         <w:rPr>
@@ -1144,7 +1535,15 @@
         <w:t>On Linux,</w:t>
       </w:r>
       <w:r>
-        <w:t xml:space="preserve"> similar settings must be made and</w:t>
+        <w:t xml:space="preserve"> similar settings must be </w:t>
+      </w:r>
+      <w:proofErr w:type="gramStart"/>
+      <w:r>
+        <w:t>made</w:t>
+      </w:r>
+      <w:proofErr w:type="gramEnd"/>
+      <w:r>
+        <w:t xml:space="preserve"> and</w:t>
       </w:r>
       <w:r>
         <w:t xml:space="preserve"> the system suspend must be disabled so that it does not shut things down in the middle of a demonstration or long run. This requires the following:</w:t>
@@ -1174,6 +1573,7 @@
       <w:r>
         <w:t xml:space="preserve">use the </w:t>
       </w:r>
+      <w:proofErr w:type="spellStart"/>
       <w:r>
         <w:rPr>
           <w:i/>
@@ -1181,6 +1581,7 @@
         </w:rPr>
         <w:t>PowerMizer</w:t>
       </w:r>
+      <w:proofErr w:type="spellEnd"/>
       <w:r>
         <w:t xml:space="preserve"> control panel to set </w:t>
       </w:r>
@@ -1216,8 +1617,21 @@
           <w:numId w:val="8"/>
         </w:numPr>
       </w:pPr>
-      <w:r>
-        <w:t>nvidia-settings -a '[gpu:0]/GPUPowerMizerMode=1'</w:t>
+      <w:proofErr w:type="spellStart"/>
+      <w:r>
+        <w:t>nvidia</w:t>
+      </w:r>
+      <w:proofErr w:type="spellEnd"/>
+      <w:r>
+        <w:t>-settings -a '[gpu:0]/</w:t>
+      </w:r>
+      <w:proofErr w:type="spellStart"/>
+      <w:r>
+        <w:t>GPUPowerMizerMode</w:t>
+      </w:r>
+      <w:proofErr w:type="spellEnd"/>
+      <w:r>
+        <w:t>=1'</w:t>
       </w:r>
     </w:p>
     <w:p>
@@ -1244,8 +1658,18 @@
         <w:t xml:space="preserve">Add the following lines to a new file named </w:t>
       </w:r>
       <w:r>
-        <w:t>~/.xprofile</w:t>
-      </w:r>
+        <w:t>~</w:t>
+      </w:r>
+      <w:proofErr w:type="gramStart"/>
+      <w:r>
+        <w:t>/.</w:t>
+      </w:r>
+      <w:proofErr w:type="spellStart"/>
+      <w:r>
+        <w:t>xprofile</w:t>
+      </w:r>
+      <w:proofErr w:type="spellEnd"/>
+      <w:proofErr w:type="gramEnd"/>
     </w:p>
     <w:p>
       <w:pPr>
@@ -1253,7 +1677,31 @@
         <w:ind w:left="2880"/>
       </w:pPr>
       <w:r>
-        <w:t>/usr/bin/nvidia-settings -a '[gpu:0]/GPUPowerMizerMode=1'</w:t>
+        <w:t>/</w:t>
+      </w:r>
+      <w:proofErr w:type="spellStart"/>
+      <w:r>
+        <w:t>usr</w:t>
+      </w:r>
+      <w:proofErr w:type="spellEnd"/>
+      <w:r>
+        <w:t>/bin/</w:t>
+      </w:r>
+      <w:proofErr w:type="spellStart"/>
+      <w:r>
+        <w:t>nvidia</w:t>
+      </w:r>
+      <w:proofErr w:type="spellEnd"/>
+      <w:r>
+        <w:t>-settings -a '[gpu:0]/</w:t>
+      </w:r>
+      <w:proofErr w:type="spellStart"/>
+      <w:r>
+        <w:t>GPUPowerMizerMode</w:t>
+      </w:r>
+      <w:proofErr w:type="spellEnd"/>
+      <w:r>
+        <w:t>=1'</w:t>
       </w:r>
     </w:p>
     <w:p>
@@ -1276,12 +1724,27 @@
         <w:pStyle w:val="ListParagraph"/>
         <w:ind w:left="2880"/>
       </w:pPr>
+      <w:proofErr w:type="spellStart"/>
       <w:r>
         <w:t>c</w:t>
       </w:r>
       <w:r>
-        <w:t>hmod +x ~/.xprofile</w:t>
-      </w:r>
+        <w:t>hmod</w:t>
+      </w:r>
+      <w:proofErr w:type="spellEnd"/>
+      <w:r>
+        <w:t xml:space="preserve"> +x ~</w:t>
+      </w:r>
+      <w:proofErr w:type="gramStart"/>
+      <w:r>
+        <w:t>/.</w:t>
+      </w:r>
+      <w:proofErr w:type="spellStart"/>
+      <w:r>
+        <w:t>xprofile</w:t>
+      </w:r>
+      <w:proofErr w:type="spellEnd"/>
+      <w:proofErr w:type="gramEnd"/>
     </w:p>
     <w:p>
       <w:pPr>
@@ -1299,8 +1762,33 @@
           <w:i/>
           <w:iCs/>
         </w:rPr>
-        <w:t>/etc/system/sleep.conf</w:t>
-      </w:r>
+        <w:t>/</w:t>
+      </w:r>
+      <w:proofErr w:type="spellStart"/>
+      <w:r>
+        <w:rPr>
+          <w:i/>
+          <w:iCs/>
+        </w:rPr>
+        <w:t>etc</w:t>
+      </w:r>
+      <w:proofErr w:type="spellEnd"/>
+      <w:r>
+        <w:rPr>
+          <w:i/>
+          <w:iCs/>
+        </w:rPr>
+        <w:t>/system/</w:t>
+      </w:r>
+      <w:proofErr w:type="spellStart"/>
+      <w:r>
+        <w:rPr>
+          <w:i/>
+          <w:iCs/>
+        </w:rPr>
+        <w:t>sleep.conf</w:t>
+      </w:r>
+      <w:proofErr w:type="spellEnd"/>
       <w:r>
         <w:t xml:space="preserve"> and uncomment the following lines in the [Sleep] section, setting their values to </w:t>
       </w:r>
@@ -1314,6 +1802,7 @@
       <w:r>
         <w:t xml:space="preserve">: </w:t>
       </w:r>
+      <w:proofErr w:type="spellStart"/>
       <w:r>
         <w:rPr>
           <w:i/>
@@ -1321,9 +1810,11 @@
         </w:rPr>
         <w:t>AllowSuspend</w:t>
       </w:r>
+      <w:proofErr w:type="spellEnd"/>
       <w:r>
         <w:t xml:space="preserve">, </w:t>
       </w:r>
+      <w:proofErr w:type="spellStart"/>
       <w:r>
         <w:rPr>
           <w:i/>
@@ -1331,9 +1822,11 @@
         </w:rPr>
         <w:t>AllowHibernation</w:t>
       </w:r>
+      <w:proofErr w:type="spellEnd"/>
       <w:r>
         <w:t xml:space="preserve">, </w:t>
       </w:r>
+      <w:proofErr w:type="spellStart"/>
       <w:r>
         <w:rPr>
           <w:i/>
@@ -1341,9 +1834,11 @@
         </w:rPr>
         <w:t>AllowSuspendThenHibernate</w:t>
       </w:r>
+      <w:proofErr w:type="spellEnd"/>
       <w:r>
         <w:t xml:space="preserve">, </w:t>
       </w:r>
+      <w:proofErr w:type="spellStart"/>
       <w:r>
         <w:rPr>
           <w:i/>
@@ -1352,6 +1847,7 @@
         </w:rPr>
         <w:t>AllowHybridSleep</w:t>
       </w:r>
+      <w:proofErr w:type="spellEnd"/>
       <w:r>
         <w:t>.</w:t>
       </w:r>
@@ -1385,7 +1881,15 @@
         <w:t>Blank Screen After</w:t>
       </w:r>
       <w:r>
-        <w:t xml:space="preserve"> slider to the left to set it to </w:t>
+        <w:t xml:space="preserve"> slider to the left to set it </w:t>
+      </w:r>
+      <w:proofErr w:type="gramStart"/>
+      <w:r>
+        <w:t>to</w:t>
+      </w:r>
+      <w:proofErr w:type="gramEnd"/>
+      <w:r>
+        <w:t xml:space="preserve"> </w:t>
       </w:r>
       <w:r>
         <w:rPr>
@@ -1412,6 +1916,7 @@
         <w:pStyle w:val="Heading1"/>
       </w:pPr>
       <w:r>
+        <w:lastRenderedPageBreak/>
         <w:t>Disk tuning</w:t>
       </w:r>
     </w:p>
@@ -1424,7 +1929,15 @@
         <w:t>Direct writes:</w:t>
       </w:r>
       <w:r>
-        <w:t xml:space="preserve"> When writing sequentially to LLVM drives in hardware RAID configuration, the internal operating system buffers slow down the system. On Linux, it is possible to specify that file data be directly read from the client buffers by passing the </w:t>
+        <w:t xml:space="preserve"> When writing sequentially to LLVM drives in hardware RAID configuration, the internal operating system buffers slow down the system. On Linux, it is possible to specify that file data </w:t>
+      </w:r>
+      <w:proofErr w:type="gramStart"/>
+      <w:r>
+        <w:t>be</w:t>
+      </w:r>
+      <w:proofErr w:type="gramEnd"/>
+      <w:r>
+        <w:t xml:space="preserve"> directly read from the client buffers by passing the </w:t>
       </w:r>
       <w:r>
         <w:rPr>
@@ -1434,7 +1947,15 @@
         <w:t>O_DIRECT</w:t>
       </w:r>
       <w:r>
-        <w:t xml:space="preserve"> flag to the open() system call when opening the file.</w:t>
+        <w:t xml:space="preserve"> flag to the </w:t>
+      </w:r>
+      <w:proofErr w:type="gramStart"/>
+      <w:r>
+        <w:t>open(</w:t>
+      </w:r>
+      <w:proofErr w:type="gramEnd"/>
+      <w:r>
+        <w:t>) system call when opening the file.</w:t>
       </w:r>
       <w:r>
         <w:t xml:space="preserve"> </w:t>
@@ -1447,7 +1968,23 @@
         <w:t>Note:</w:t>
       </w:r>
       <w:r>
-        <w:t xml:space="preserve"> When using direct write, the number of bytes written in any write must be a multiple of</w:t>
+        <w:t xml:space="preserve"> When using direct </w:t>
+      </w:r>
+      <w:proofErr w:type="gramStart"/>
+      <w:r>
+        <w:t>write</w:t>
+      </w:r>
+      <w:proofErr w:type="gramEnd"/>
+      <w:r>
+        <w:t xml:space="preserve">, the number of bytes written in any </w:t>
+      </w:r>
+      <w:proofErr w:type="gramStart"/>
+      <w:r>
+        <w:t>write</w:t>
+      </w:r>
+      <w:proofErr w:type="gramEnd"/>
+      <w:r>
+        <w:t xml:space="preserve"> must be a multiple of</w:t>
       </w:r>
       <w:r>
         <w:t xml:space="preserve"> the block size (</w:t>
@@ -1472,7 +2009,15 @@
         <w:t>Note:</w:t>
       </w:r>
       <w:r>
-        <w:t xml:space="preserve"> This restriction also holds for using writev, in which case each of the individual blocks must also be a multiple of 512 in size. </w:t>
+        <w:t xml:space="preserve"> This restriction also holds for using </w:t>
+      </w:r>
+      <w:proofErr w:type="spellStart"/>
+      <w:r>
+        <w:t>writev</w:t>
+      </w:r>
+      <w:proofErr w:type="spellEnd"/>
+      <w:r>
+        <w:t xml:space="preserve">, in which case each of the individual blocks must also be a multiple of 512 in size. </w:t>
       </w:r>
       <w:r>
         <w:rPr>
@@ -1495,21 +2040,29 @@
         <w:t>Note:</w:t>
       </w:r>
       <w:r>
-        <w:t xml:space="preserve"> This was handled in the API by enabling StreamPackets to be written sequentially into the same large buffer; the plan is to write that buffer when it becomes full and copy the remaining unwritten bytes into a new buffer ready to be filled, then flush the (zero-padded) empty buffer at the end of writing.</w:t>
-      </w:r>
-    </w:p>
-    <w:p>
-      <w:r>
-        <w:rPr>
-          <w:b/>
-          <w:bCs/>
-        </w:rPr>
-        <w:lastRenderedPageBreak/>
+        <w:t xml:space="preserve"> This was handled in the API by enabling </w:t>
+      </w:r>
+      <w:proofErr w:type="spellStart"/>
+      <w:r>
+        <w:t>StreamPackets</w:t>
+      </w:r>
+      <w:proofErr w:type="spellEnd"/>
+      <w:r>
+        <w:t xml:space="preserve"> to be written sequentially into the same large buffer; the plan is to write that buffer when it becomes full and copy the remaining unwritten bytes into a new buffer ready to be filled, then flush the (zero-padded) empty buffer at the end of writing.</w:t>
+      </w:r>
+    </w:p>
+    <w:p>
+      <w:r>
+        <w:rPr>
+          <w:b/>
+          <w:bCs/>
+        </w:rPr>
         <w:t>TRIM:</w:t>
       </w:r>
       <w:r>
         <w:t xml:space="preserve"> SSD drives must explicitly erase old blocks before re-use, which sometimes requires consolidation of information from partial blocks. If this is not done before the buffers are needed for new writes, writing performance can slow down. On Linux, the </w:t>
       </w:r>
+      <w:proofErr w:type="spellStart"/>
       <w:r>
         <w:rPr>
           <w:i/>
@@ -1517,6 +2070,7 @@
         </w:rPr>
         <w:t>fstrim</w:t>
       </w:r>
+      <w:proofErr w:type="spellEnd"/>
       <w:r>
         <w:t xml:space="preserve"> command can be used to manually clear out old buffers. Also, the </w:t>
       </w:r>
@@ -1541,8 +2095,33 @@
           <w:i/>
           <w:iCs/>
         </w:rPr>
-        <w:t>/etc/fstab</w:t>
-      </w:r>
+        <w:t>/</w:t>
+      </w:r>
+      <w:proofErr w:type="spellStart"/>
+      <w:r>
+        <w:rPr>
+          <w:i/>
+          <w:iCs/>
+        </w:rPr>
+        <w:t>etc</w:t>
+      </w:r>
+      <w:proofErr w:type="spellEnd"/>
+      <w:r>
+        <w:rPr>
+          <w:i/>
+          <w:iCs/>
+        </w:rPr>
+        <w:t>/</w:t>
+      </w:r>
+      <w:proofErr w:type="spellStart"/>
+      <w:r>
+        <w:rPr>
+          <w:i/>
+          <w:iCs/>
+        </w:rPr>
+        <w:t>fstab</w:t>
+      </w:r>
+      <w:proofErr w:type="spellEnd"/>
       <w:r>
         <w:t xml:space="preserve"> entry that mounts the drive, </w:t>
       </w:r>
@@ -1561,13 +2140,49 @@
       <w:r>
         <w:t xml:space="preserve"> Disabling trimming except weekly can be done using the </w:t>
       </w:r>
-      <w:r>
-        <w:rPr>
-          <w:i/>
-          <w:iCs/>
-        </w:rPr>
-        <w:t>sudo systemctl enable --now fstrim.timer</w:t>
-      </w:r>
+      <w:proofErr w:type="spellStart"/>
+      <w:r>
+        <w:rPr>
+          <w:i/>
+          <w:iCs/>
+        </w:rPr>
+        <w:t>sudo</w:t>
+      </w:r>
+      <w:proofErr w:type="spellEnd"/>
+      <w:r>
+        <w:rPr>
+          <w:i/>
+          <w:iCs/>
+        </w:rPr>
+        <w:t xml:space="preserve"> </w:t>
+      </w:r>
+      <w:proofErr w:type="spellStart"/>
+      <w:r>
+        <w:rPr>
+          <w:i/>
+          <w:iCs/>
+        </w:rPr>
+        <w:t>systemctl</w:t>
+      </w:r>
+      <w:proofErr w:type="spellEnd"/>
+      <w:r>
+        <w:rPr>
+          <w:i/>
+          <w:iCs/>
+        </w:rPr>
+        <w:t xml:space="preserve"> enable --now </w:t>
+      </w:r>
+      <w:proofErr w:type="spellStart"/>
+      <w:proofErr w:type="gramStart"/>
+      <w:r>
+        <w:rPr>
+          <w:i/>
+          <w:iCs/>
+        </w:rPr>
+        <w:t>fstrim.timer</w:t>
+      </w:r>
+      <w:proofErr w:type="spellEnd"/>
+      <w:proofErr w:type="gramEnd"/>
       <w:r>
         <w:t xml:space="preserve"> command.</w:t>
       </w:r>
@@ -1599,7 +2214,15 @@
         <w:t>Disable journaling:</w:t>
       </w:r>
       <w:r>
-        <w:t xml:space="preserve"> It is possible to disable journaling on the file system used on SSD, which will lose data if the system loses power but may increase the write speed.</w:t>
+        <w:t xml:space="preserve"> It is possible to disable journaling on the file system used on SSD, which will lose data if the system loses power but may increase the </w:t>
+      </w:r>
+      <w:proofErr w:type="gramStart"/>
+      <w:r>
+        <w:t>write</w:t>
+      </w:r>
+      <w:proofErr w:type="gramEnd"/>
+      <w:r>
+        <w:t xml:space="preserve"> speed.</w:t>
       </w:r>
     </w:p>
     <w:p>
@@ -1636,7 +2259,23 @@
         <w:t>Attached router:</w:t>
       </w:r>
       <w:r>
-        <w:t xml:space="preserve"> When using an XSight display that sends multicast packets to the Render Server, the receiving Ubuntu server must be attached to a router. That router does not need to be connected to anything else (or to the Internet), but having it provides multicast support that enables the host to then receive multicast packets on all its NICs. For some configurations, the NIC address 0.0.0.0 must be used rather than the address of the NIC receiving packets.</w:t>
+        <w:t xml:space="preserve"> When using an </w:t>
+      </w:r>
+      <w:proofErr w:type="spellStart"/>
+      <w:r>
+        <w:t>XSight</w:t>
+      </w:r>
+      <w:proofErr w:type="spellEnd"/>
+      <w:r>
+        <w:t xml:space="preserve"> display that sends multicast packets to the Render Server, the receiving Ubuntu server must be attached to a router. That router does not need to be connected to anything else (or to the Internet), </w:t>
+      </w:r>
+      <w:proofErr w:type="gramStart"/>
+      <w:r>
+        <w:t>but having</w:t>
+      </w:r>
+      <w:proofErr w:type="gramEnd"/>
+      <w:r>
+        <w:t xml:space="preserve"> it provides multicast support that enables the host to then receive multicast packets on all its NICs. For some configurations, the NIC address 0.0.0.0 must be used rather than the address of the NIC receiving packets.</w:t>
       </w:r>
     </w:p>
     <w:p>
@@ -1648,7 +2287,31 @@
         <w:t>Cabling and reboot:</w:t>
       </w:r>
       <w:r>
-        <w:t xml:space="preserve"> Testing on 8/29/2024 found 60Hz 25-camera streaming working from the Storage host to the Render host, but missing packets when sending the other direction even for 18-21 cameras. Switching the ends of the fiber cable between hosts required rebooting to re-establish all configuration settings (the cable swap did seem to improve things, but not solve the problem). Once reboot was performed, data could stream both directions without loss.</w:t>
+        <w:t xml:space="preserve"> Testing on 8/29/2024 found 60Hz 25-camera streaming working from the Storage host to the Render host, but missing packets when sending the other direction even for 18-21 cameras. Switching the ends of the fiber cable between hosts required rebooting to re-establish all configuration settings (the cable swap did seem to improve </w:t>
+      </w:r>
+      <w:proofErr w:type="gramStart"/>
+      <w:r>
+        <w:t>things, but</w:t>
+      </w:r>
+      <w:proofErr w:type="gramEnd"/>
+      <w:r>
+        <w:t xml:space="preserve"> </w:t>
+      </w:r>
+      <w:proofErr w:type="gramStart"/>
+      <w:r>
+        <w:t>not</w:t>
+      </w:r>
+      <w:proofErr w:type="gramEnd"/>
+      <w:r>
+        <w:t xml:space="preserve"> solve the problem). Once reboot was performed, data could </w:t>
+      </w:r>
+      <w:proofErr w:type="gramStart"/>
+      <w:r>
+        <w:t>stream</w:t>
+      </w:r>
+      <w:proofErr w:type="gramEnd"/>
+      <w:r>
+        <w:t xml:space="preserve"> both directions without loss.</w:t>
       </w:r>
     </w:p>
     <w:p>
@@ -1714,6 +2377,7 @@
         </w:numPr>
       </w:pPr>
       <w:r>
+        <w:lastRenderedPageBreak/>
         <w:t>Interrupt moderation: Reducing the number of interrupts to the CPU cores by waiting for multiple packets to arrive using counters and timers as described here</w:t>
       </w:r>
       <w:r>
@@ -1793,7 +2457,15 @@
         </w:numPr>
       </w:pPr>
       <w:r>
-        <w:t>(not done) Linux sysctl tuning: As described here</w:t>
+        <w:t xml:space="preserve">(not done) Linux </w:t>
+      </w:r>
+      <w:proofErr w:type="spellStart"/>
+      <w:r>
+        <w:t>sysctl</w:t>
+      </w:r>
+      <w:proofErr w:type="spellEnd"/>
+      <w:r>
+        <w:t xml:space="preserve"> tuning: As described here</w:t>
       </w:r>
       <w:r>
         <w:rPr>
@@ -1839,7 +2511,6 @@
         </w:numPr>
       </w:pPr>
       <w:r>
-        <w:lastRenderedPageBreak/>
         <w:t>(not done) Use the CPU cores directly connected to the relevant PCIe bus where the Mellanox adapter is located.</w:t>
       </w:r>
     </w:p>
@@ -2011,7 +2682,15 @@
         <w:t>4096</w:t>
       </w:r>
       <w:r>
-        <w:t xml:space="preserve"> (for the ATTO Thunderlink, set this to 4000).</w:t>
+        <w:t xml:space="preserve"> (for the ATTO </w:t>
+      </w:r>
+      <w:proofErr w:type="spellStart"/>
+      <w:r>
+        <w:t>Thunderlink</w:t>
+      </w:r>
+      <w:proofErr w:type="spellEnd"/>
+      <w:r>
+        <w:t>, set this to 4000).</w:t>
       </w:r>
     </w:p>
     <w:p>
@@ -2041,7 +2720,15 @@
         <w:t xml:space="preserve">(Fixed in the more recent adapter driver available in April 2025.) </w:t>
       </w:r>
       <w:r>
-        <w:t>The IPV4 address cannot be configured using the Windows 11 interface. The older approach works: Control Panel, Network, Change adapter settings (ends up in Network Connections), right-click Properties (on selected interface). To navigate th</w:t>
+        <w:t xml:space="preserve">The IPV4 address cannot be configured using the Windows 11 interface. The older approach works: Control Panel, Network, </w:t>
+      </w:r>
+      <w:proofErr w:type="gramStart"/>
+      <w:r>
+        <w:t>Change</w:t>
+      </w:r>
+      <w:proofErr w:type="gramEnd"/>
+      <w:r>
+        <w:t xml:space="preserve"> adapter settings (ends up in Network Connections), right-click Properties (on selected interface). To navigate th</w:t>
       </w:r>
       <w:r>
         <w:t>r</w:t>
@@ -2069,8 +2756,17 @@
           <w:b/>
           <w:bCs/>
         </w:rPr>
-        <w:t>ATTO Thunderlink</w:t>
-      </w:r>
+        <w:t xml:space="preserve">ATTO </w:t>
+      </w:r>
+      <w:proofErr w:type="spellStart"/>
+      <w:r>
+        <w:rPr>
+          <w:b/>
+          <w:bCs/>
+        </w:rPr>
+        <w:t>Thunderlink</w:t>
+      </w:r>
+      <w:proofErr w:type="spellEnd"/>
       <w:r>
         <w:t xml:space="preserve">, </w:t>
       </w:r>
@@ -2097,7 +2793,11 @@
         <w:t>E</w:t>
       </w:r>
       <w:r>
-        <w:t xml:space="preserve">nsure that the link speed is 50-100Gigabits; the default seems to set to 25. Do this in the Device Manager by changing the Advanced setting of </w:t>
+        <w:t xml:space="preserve">nsure that the link speed is 50-100Gigabits; the default seems to set to 25. Do this in the Device Manager by changing the Advanced </w:t>
+      </w:r>
+      <w:proofErr w:type="gramStart"/>
+      <w:r>
+        <w:t xml:space="preserve">setting of </w:t>
       </w:r>
       <w:r>
         <w:rPr>
@@ -2106,6 +2806,7 @@
         </w:rPr>
         <w:t>Speed &amp; Duplex</w:t>
       </w:r>
+      <w:proofErr w:type="gramEnd"/>
       <w:r>
         <w:t xml:space="preserve"> from </w:t>
       </w:r>
@@ -2225,12 +2926,14 @@
           <w:strike/>
         </w:rPr>
       </w:pPr>
+      <w:proofErr w:type="spellStart"/>
       <w:r>
         <w:rPr>
           <w:strike/>
         </w:rPr>
         <w:t>EnableDynamicBacklog</w:t>
       </w:r>
+      <w:proofErr w:type="spellEnd"/>
       <w:r>
         <w:rPr>
           <w:strike/>
@@ -2271,7 +2974,15 @@
         </w:numPr>
       </w:pPr>
       <w:r>
-        <w:t>get-netconnectionprofile (lists all interfaces that are connected and active). For this situation, since the 100GigE interface cannot access the Internet, the name is "Unidentified network"</w:t>
+        <w:t>get-</w:t>
+      </w:r>
+      <w:proofErr w:type="spellStart"/>
+      <w:r>
+        <w:t>netconnectionprofile</w:t>
+      </w:r>
+      <w:proofErr w:type="spellEnd"/>
+      <w:r>
+        <w:t xml:space="preserve"> (lists all interfaces that are connected and active). For this situation, since the 100GigE interface cannot access the Internet, the name is "Unidentified network"</w:t>
       </w:r>
     </w:p>
     <w:p>
@@ -2283,7 +2994,15 @@
         </w:numPr>
       </w:pPr>
       <w:r>
-        <w:t>set-netconnectionprofile -name "Unidentified network" -network private</w:t>
+        <w:t>set-</w:t>
+      </w:r>
+      <w:proofErr w:type="spellStart"/>
+      <w:r>
+        <w:t>netconnectionprofile</w:t>
+      </w:r>
+      <w:proofErr w:type="spellEnd"/>
+      <w:r>
+        <w:t xml:space="preserve"> -name "Unidentified network" -network private</w:t>
       </w:r>
     </w:p>
     <w:p>
@@ -2295,6 +3014,7 @@
         </w:numPr>
       </w:pPr>
       <w:r>
+        <w:lastRenderedPageBreak/>
         <w:t xml:space="preserve">There is documentation on tuning the cards at </w:t>
       </w:r>
       <w:hyperlink r:id="rId9" w:history="1">
@@ -2328,8 +3048,17 @@
           <w:b/>
           <w:bCs/>
         </w:rPr>
-        <w:t>ATTO Thunderlink</w:t>
-      </w:r>
+        <w:t xml:space="preserve">ATTO </w:t>
+      </w:r>
+      <w:proofErr w:type="spellStart"/>
+      <w:r>
+        <w:rPr>
+          <w:b/>
+          <w:bCs/>
+        </w:rPr>
+        <w:t>Thunderlink</w:t>
+      </w:r>
+      <w:proofErr w:type="spellEnd"/>
       <w:r>
         <w:t xml:space="preserve"> </w:t>
       </w:r>
@@ -2351,32 +3080,59 @@
       <w:r>
         <w:t xml:space="preserve">un </w:t>
       </w:r>
-      <w:r>
-        <w:rPr>
-          <w:i/>
-          <w:iCs/>
-        </w:rPr>
-        <w:t>sudo apt install thunderbolt-tools</w:t>
+      <w:proofErr w:type="spellStart"/>
+      <w:r>
+        <w:rPr>
+          <w:i/>
+          <w:iCs/>
+        </w:rPr>
+        <w:t>sudo</w:t>
+      </w:r>
+      <w:proofErr w:type="spellEnd"/>
+      <w:r>
+        <w:rPr>
+          <w:i/>
+          <w:iCs/>
+        </w:rPr>
+        <w:t xml:space="preserve"> apt install thunderbolt-tools</w:t>
       </w:r>
       <w:r>
         <w:t xml:space="preserve"> to get the Intel Thunderbolt tools. After the device is plugged in run </w:t>
       </w:r>
-      <w:r>
-        <w:rPr>
-          <w:i/>
-          <w:iCs/>
-        </w:rPr>
-        <w:t>fwupdmgr get-devices</w:t>
+      <w:proofErr w:type="spellStart"/>
+      <w:r>
+        <w:rPr>
+          <w:i/>
+          <w:iCs/>
+        </w:rPr>
+        <w:t>fwupdmgr</w:t>
+      </w:r>
+      <w:proofErr w:type="spellEnd"/>
+      <w:r>
+        <w:rPr>
+          <w:i/>
+          <w:iCs/>
+        </w:rPr>
+        <w:t xml:space="preserve"> get-devices</w:t>
       </w:r>
       <w:r>
         <w:t xml:space="preserve"> to detect the device; after that, the blue lights come on and running </w:t>
       </w:r>
-      <w:r>
-        <w:rPr>
-          <w:i/>
-          <w:iCs/>
-        </w:rPr>
-        <w:t>boltctl list</w:t>
+      <w:proofErr w:type="spellStart"/>
+      <w:r>
+        <w:rPr>
+          <w:i/>
+          <w:iCs/>
+        </w:rPr>
+        <w:t>boltctl</w:t>
+      </w:r>
+      <w:proofErr w:type="spellEnd"/>
+      <w:r>
+        <w:rPr>
+          <w:i/>
+          <w:iCs/>
+        </w:rPr>
+        <w:t xml:space="preserve"> list</w:t>
       </w:r>
       <w:r>
         <w:t xml:space="preserve"> will show the device.</w:t>
@@ -2412,15 +3168,32 @@
       <w:r>
         <w:t xml:space="preserve">Run </w:t>
       </w:r>
-      <w:r>
-        <w:rPr>
-          <w:i/>
-          <w:iCs/>
-        </w:rPr>
-        <w:t>sudo ./network_tuning_ATTO.sh</w:t>
-      </w:r>
-      <w:r>
-        <w:t xml:space="preserve"> in the ASDP_Core_API repository to configure the cards for 50Gbits/second full duplex and set other required network settings.</w:t>
+      <w:proofErr w:type="spellStart"/>
+      <w:r>
+        <w:rPr>
+          <w:i/>
+          <w:iCs/>
+        </w:rPr>
+        <w:t>sudo</w:t>
+      </w:r>
+      <w:proofErr w:type="spellEnd"/>
+      <w:r>
+        <w:rPr>
+          <w:i/>
+          <w:iCs/>
+        </w:rPr>
+        <w:t xml:space="preserve"> ./network_tuning_ATTO.sh</w:t>
+      </w:r>
+      <w:r>
+        <w:t xml:space="preserve"> in the </w:t>
+      </w:r>
+      <w:proofErr w:type="spellStart"/>
+      <w:r>
+        <w:t>ASDP_Core_API</w:t>
+      </w:r>
+      <w:proofErr w:type="spellEnd"/>
+      <w:r>
+        <w:t xml:space="preserve"> repository to configure the cards for 50Gbits/second full duplex and set other required network settings.</w:t>
       </w:r>
     </w:p>
     <w:p>
@@ -2449,23 +3222,54 @@
       <w:r>
         <w:t xml:space="preserve"> To set this on device DEV, use </w:t>
       </w:r>
-      <w:r>
-        <w:rPr>
-          <w:b/>
-          <w:bCs/>
-          <w:i/>
-          <w:iCs/>
-        </w:rPr>
-        <w:t>sudo i</w:t>
-      </w:r>
-      <w:r>
-        <w:rPr>
-          <w:b/>
-          <w:bCs/>
-          <w:i/>
-          <w:iCs/>
-        </w:rPr>
-        <w:t xml:space="preserve">fconfig </w:t>
+      <w:proofErr w:type="spellStart"/>
+      <w:r>
+        <w:rPr>
+          <w:b/>
+          <w:bCs/>
+          <w:i/>
+          <w:iCs/>
+        </w:rPr>
+        <w:t>sudo</w:t>
+      </w:r>
+      <w:proofErr w:type="spellEnd"/>
+      <w:r>
+        <w:rPr>
+          <w:b/>
+          <w:bCs/>
+          <w:i/>
+          <w:iCs/>
+        </w:rPr>
+        <w:t xml:space="preserve"> </w:t>
+      </w:r>
+      <w:proofErr w:type="spellStart"/>
+      <w:r>
+        <w:rPr>
+          <w:b/>
+          <w:bCs/>
+          <w:i/>
+          <w:iCs/>
+        </w:rPr>
+        <w:t>i</w:t>
+      </w:r>
+      <w:r>
+        <w:rPr>
+          <w:b/>
+          <w:bCs/>
+          <w:i/>
+          <w:iCs/>
+        </w:rPr>
+        <w:t>fconfig</w:t>
+      </w:r>
+      <w:proofErr w:type="spellEnd"/>
+      <w:r>
+        <w:rPr>
+          <w:b/>
+          <w:bCs/>
+          <w:i/>
+          <w:iCs/>
+        </w:rPr>
+        <w:t xml:space="preserve"> </w:t>
       </w:r>
       <w:r>
         <w:rPr>
@@ -2483,7 +3287,27 @@
           <w:i/>
           <w:iCs/>
         </w:rPr>
-        <w:t xml:space="preserve"> mtu 9000</w:t>
+        <w:t xml:space="preserve"> </w:t>
+      </w:r>
+      <w:proofErr w:type="spellStart"/>
+      <w:r>
+        <w:rPr>
+          <w:b/>
+          <w:bCs/>
+          <w:i/>
+          <w:iCs/>
+        </w:rPr>
+        <w:t>mtu</w:t>
+      </w:r>
+      <w:proofErr w:type="spellEnd"/>
+      <w:r>
+        <w:rPr>
+          <w:b/>
+          <w:bCs/>
+          <w:i/>
+          <w:iCs/>
+        </w:rPr>
+        <w:t xml:space="preserve"> 9000</w:t>
       </w:r>
       <w:r>
         <w:t xml:space="preserve"> on the host</w:t>
@@ -2521,101 +3345,1173 @@
           <w:b/>
           <w:bCs/>
         </w:rPr>
+        <w:t>Mellanox tuning:</w:t>
+      </w:r>
+      <w:r>
+        <w:t xml:space="preserve"> A set of tools for tuning Mellanox parameters is available here</w:t>
+      </w:r>
+      <w:r>
+        <w:rPr>
+          <w:rStyle w:val="FootnoteReference"/>
+        </w:rPr>
+        <w:footnoteReference w:id="8"/>
+      </w:r>
+      <w:r>
+        <w:t xml:space="preserve">. This Mellanox git repository includes a python subdirectory that has a </w:t>
+      </w:r>
+      <w:proofErr w:type="spellStart"/>
+      <w:r>
+        <w:rPr>
+          <w:b/>
+          <w:bCs/>
+          <w:i/>
+          <w:iCs/>
+        </w:rPr>
+        <w:t>mlnx_tune</w:t>
+      </w:r>
+      <w:proofErr w:type="spellEnd"/>
+      <w:r>
+        <w:t xml:space="preserve"> utility. When run as root, it configures the system for one of the specified profiles (use </w:t>
+      </w:r>
+      <w:proofErr w:type="spellStart"/>
+      <w:r>
+        <w:rPr>
+          <w:b/>
+          <w:bCs/>
+          <w:i/>
+          <w:iCs/>
+        </w:rPr>
+        <w:t>sudo</w:t>
+      </w:r>
+      <w:proofErr w:type="spellEnd"/>
+      <w:r>
+        <w:rPr>
+          <w:b/>
+          <w:bCs/>
+          <w:i/>
+          <w:iCs/>
+        </w:rPr>
+        <w:t xml:space="preserve"> python3 </w:t>
+      </w:r>
+      <w:proofErr w:type="spellStart"/>
+      <w:r>
+        <w:rPr>
+          <w:b/>
+          <w:bCs/>
+          <w:i/>
+          <w:iCs/>
+        </w:rPr>
+        <w:t>mlnx_tune</w:t>
+      </w:r>
+      <w:proofErr w:type="spellEnd"/>
+      <w:r>
+        <w:rPr>
+          <w:b/>
+          <w:bCs/>
+          <w:i/>
+          <w:iCs/>
+        </w:rPr>
+        <w:t xml:space="preserve"> -h</w:t>
+      </w:r>
+      <w:r>
+        <w:t xml:space="preserve"> to get a list of the profiles. Two likely choices are HIGH_THROUGHPUT and </w:t>
+      </w:r>
+      <w:r>
+        <w:t>IP_FORWARDING_MULTI_STREAM_0_LOSS</w:t>
+      </w:r>
+      <w:r>
+        <w:t xml:space="preserve">. We </w:t>
+      </w:r>
+      <w:r>
+        <w:t>ran</w:t>
+      </w:r>
+      <w:r>
+        <w:t xml:space="preserve"> this command to configure HIGH_THROUGHPUT </w:t>
+      </w:r>
+      <w:r>
+        <w:t xml:space="preserve">on all systems where we were able </w:t>
+      </w:r>
+      <w:r>
+        <w:t xml:space="preserve">to get full-rate </w:t>
+      </w:r>
+      <w:r>
+        <w:t>receiving</w:t>
+      </w:r>
+      <w:r>
+        <w:t xml:space="preserve"> to work reliably: </w:t>
+      </w:r>
+      <w:proofErr w:type="spellStart"/>
+      <w:r>
+        <w:rPr>
+          <w:b/>
+          <w:bCs/>
+          <w:i/>
+          <w:iCs/>
+        </w:rPr>
+        <w:t>sudo</w:t>
+      </w:r>
+      <w:proofErr w:type="spellEnd"/>
+      <w:r>
+        <w:rPr>
+          <w:b/>
+          <w:bCs/>
+          <w:i/>
+          <w:iCs/>
+        </w:rPr>
+        <w:t xml:space="preserve"> python3 </w:t>
+      </w:r>
+      <w:proofErr w:type="spellStart"/>
+      <w:r>
+        <w:rPr>
+          <w:b/>
+          <w:bCs/>
+          <w:i/>
+          <w:iCs/>
+        </w:rPr>
+        <w:t>mlnx_tune</w:t>
+      </w:r>
+      <w:proofErr w:type="spellEnd"/>
+      <w:r>
+        <w:rPr>
+          <w:b/>
+          <w:bCs/>
+          <w:i/>
+          <w:iCs/>
+        </w:rPr>
+        <w:t xml:space="preserve"> -p HIGH_THROUGHPUT</w:t>
+      </w:r>
+      <w:r>
+        <w:t xml:space="preserve"> </w:t>
+      </w:r>
+      <w:r>
+        <w:t xml:space="preserve">so </w:t>
+      </w:r>
+      <w:r>
+        <w:t xml:space="preserve">it </w:t>
+      </w:r>
+      <w:r>
+        <w:t xml:space="preserve">may </w:t>
+      </w:r>
+      <w:r>
+        <w:t xml:space="preserve">be </w:t>
+      </w:r>
+      <w:r>
+        <w:t xml:space="preserve">required </w:t>
+      </w:r>
+      <w:r>
+        <w:t xml:space="preserve">once on each system and then </w:t>
+      </w:r>
+      <w:r>
+        <w:t>the system rebooted</w:t>
+      </w:r>
+      <w:r>
+        <w:t>.</w:t>
+      </w:r>
+    </w:p>
+    <w:p>
+      <w:r>
+        <w:rPr>
+          <w:b/>
+          <w:bCs/>
+        </w:rPr>
+        <w:t>Global receive buffer size:</w:t>
+      </w:r>
+      <w:r>
+        <w:t xml:space="preserve"> There is a system-wide number of available buffers. Using </w:t>
+      </w:r>
+      <w:proofErr w:type="spellStart"/>
+      <w:r>
+        <w:rPr>
+          <w:b/>
+          <w:bCs/>
+          <w:i/>
+          <w:iCs/>
+        </w:rPr>
+        <w:t>sudo</w:t>
+      </w:r>
+      <w:proofErr w:type="spellEnd"/>
+      <w:r>
+        <w:rPr>
+          <w:b/>
+          <w:bCs/>
+          <w:i/>
+          <w:iCs/>
+        </w:rPr>
+        <w:t xml:space="preserve"> </w:t>
+      </w:r>
+      <w:proofErr w:type="spellStart"/>
+      <w:r>
+        <w:rPr>
+          <w:b/>
+          <w:bCs/>
+          <w:i/>
+          <w:iCs/>
+        </w:rPr>
+        <w:t>s</w:t>
+      </w:r>
+      <w:r>
+        <w:rPr>
+          <w:b/>
+          <w:bCs/>
+          <w:i/>
+          <w:iCs/>
+        </w:rPr>
+        <w:t>ysctl</w:t>
+      </w:r>
+      <w:proofErr w:type="spellEnd"/>
+      <w:r>
+        <w:rPr>
+          <w:b/>
+          <w:bCs/>
+          <w:i/>
+          <w:iCs/>
+        </w:rPr>
+        <w:t xml:space="preserve"> -w </w:t>
+      </w:r>
+      <w:proofErr w:type="spellStart"/>
+      <w:proofErr w:type="gramStart"/>
+      <w:r>
+        <w:rPr>
+          <w:b/>
+          <w:bCs/>
+          <w:i/>
+          <w:iCs/>
+        </w:rPr>
+        <w:t>net.core</w:t>
+      </w:r>
+      <w:proofErr w:type="gramEnd"/>
+      <w:r>
+        <w:rPr>
+          <w:b/>
+          <w:bCs/>
+          <w:i/>
+          <w:iCs/>
+        </w:rPr>
+        <w:t>.rmem_max</w:t>
+      </w:r>
+      <w:proofErr w:type="spellEnd"/>
+      <w:r>
+        <w:rPr>
+          <w:b/>
+          <w:bCs/>
+          <w:i/>
+          <w:iCs/>
+        </w:rPr>
+        <w:t>=26214400</w:t>
+      </w:r>
+      <w:r>
+        <w:t xml:space="preserve"> (25MB) on the client enabled 25-camera (5 sending threads) operation at 125fps for 180 seconds without dropped packets.</w:t>
+      </w:r>
+    </w:p>
+    <w:p>
+      <w:pPr>
+        <w:rPr>
+          <w:b/>
+          <w:bCs/>
+          <w:i/>
+          <w:iCs/>
+        </w:rPr>
+      </w:pPr>
+      <w:r>
+        <w:rPr>
+          <w:b/>
+          <w:bCs/>
+        </w:rPr>
+        <w:t>Global UDP buffer pool size:</w:t>
+      </w:r>
+      <w:r>
+        <w:t xml:space="preserve"> There is also an operating-specified limit on the total number of pages available for UDP buffers. On Linux, the net.ipv4.udp_mem (readable via </w:t>
+      </w:r>
+      <w:r>
+        <w:rPr>
+          <w:i/>
+          <w:iCs/>
+        </w:rPr>
+        <w:t>/proc/sys/net/ipv4/</w:t>
+      </w:r>
+      <w:proofErr w:type="spellStart"/>
+      <w:r>
+        <w:rPr>
+          <w:i/>
+          <w:iCs/>
+        </w:rPr>
+        <w:t>udp_mem</w:t>
+      </w:r>
+      <w:proofErr w:type="spellEnd"/>
+      <w:r>
+        <w:t xml:space="preserve">) sets the number of 4K blocks available system wide. This can be adjusted using </w:t>
+      </w:r>
+      <w:proofErr w:type="spellStart"/>
+      <w:r>
+        <w:rPr>
+          <w:i/>
+          <w:iCs/>
+        </w:rPr>
+        <w:t>sysctl</w:t>
+      </w:r>
+      <w:proofErr w:type="spellEnd"/>
+      <w:r>
+        <w:t xml:space="preserve"> and is set by default based on the total RAM size at boot time. When reaching 125fps without dropped packets, this was set on Linux using: </w:t>
+      </w:r>
+      <w:proofErr w:type="spellStart"/>
+      <w:r>
+        <w:rPr>
+          <w:b/>
+          <w:bCs/>
+          <w:i/>
+          <w:iCs/>
+        </w:rPr>
+        <w:t>sudo</w:t>
+      </w:r>
+      <w:proofErr w:type="spellEnd"/>
+      <w:r>
+        <w:rPr>
+          <w:b/>
+          <w:bCs/>
+          <w:i/>
+          <w:iCs/>
+        </w:rPr>
+        <w:t xml:space="preserve"> </w:t>
+      </w:r>
+      <w:proofErr w:type="spellStart"/>
+      <w:r>
+        <w:rPr>
+          <w:b/>
+          <w:bCs/>
+          <w:i/>
+          <w:iCs/>
+        </w:rPr>
+        <w:t>sysctl</w:t>
+      </w:r>
+      <w:proofErr w:type="spellEnd"/>
+      <w:r>
+        <w:rPr>
+          <w:b/>
+          <w:bCs/>
+          <w:i/>
+          <w:iCs/>
+        </w:rPr>
+        <w:t xml:space="preserve"> -w net.ipv4.udp_mem=4000000</w:t>
+      </w:r>
+    </w:p>
+    <w:p>
+      <w:r>
+        <w:rPr>
+          <w:b/>
+          <w:bCs/>
+        </w:rPr>
+        <w:t>Global max backlog:</w:t>
+      </w:r>
+      <w:r>
+        <w:t xml:space="preserve"> This was not needed to achieve full throughput in our systems, but it is recommended for high-throughput systems:</w:t>
+      </w:r>
+      <w:r>
+        <w:t xml:space="preserve"> </w:t>
+      </w:r>
+      <w:proofErr w:type="spellStart"/>
+      <w:r>
+        <w:rPr>
+          <w:b/>
+          <w:bCs/>
+          <w:i/>
+          <w:iCs/>
+        </w:rPr>
+        <w:t>sysctl</w:t>
+      </w:r>
+      <w:proofErr w:type="spellEnd"/>
+      <w:r>
+        <w:rPr>
+          <w:b/>
+          <w:bCs/>
+          <w:i/>
+          <w:iCs/>
+        </w:rPr>
+        <w:t xml:space="preserve"> -w </w:t>
+      </w:r>
+      <w:proofErr w:type="spellStart"/>
+      <w:proofErr w:type="gramStart"/>
+      <w:r>
+        <w:rPr>
+          <w:b/>
+          <w:bCs/>
+          <w:i/>
+          <w:iCs/>
+        </w:rPr>
+        <w:t>net.core</w:t>
+      </w:r>
+      <w:proofErr w:type="gramEnd"/>
+      <w:r>
+        <w:rPr>
+          <w:b/>
+          <w:bCs/>
+          <w:i/>
+          <w:iCs/>
+        </w:rPr>
+        <w:t>.netdev_max_backlog</w:t>
+      </w:r>
+      <w:proofErr w:type="spellEnd"/>
+      <w:r>
+        <w:rPr>
+          <w:b/>
+          <w:bCs/>
+          <w:i/>
+          <w:iCs/>
+        </w:rPr>
+        <w:t>=</w:t>
+      </w:r>
+      <w:r>
+        <w:rPr>
+          <w:b/>
+          <w:bCs/>
+          <w:i/>
+          <w:iCs/>
+        </w:rPr>
+        <w:t>3</w:t>
+      </w:r>
+      <w:r>
+        <w:rPr>
+          <w:b/>
+          <w:bCs/>
+          <w:i/>
+          <w:iCs/>
+        </w:rPr>
+        <w:t>000</w:t>
+      </w:r>
+      <w:r>
+        <w:t xml:space="preserve"> </w:t>
+      </w:r>
+      <w:r>
+        <w:t xml:space="preserve">or to make it permanent: </w:t>
+      </w:r>
+      <w:r>
+        <w:rPr>
+          <w:b/>
+          <w:bCs/>
+          <w:i/>
+          <w:iCs/>
+        </w:rPr>
+        <w:t>echo ‘</w:t>
+      </w:r>
+      <w:proofErr w:type="spellStart"/>
+      <w:proofErr w:type="gramStart"/>
+      <w:r>
+        <w:rPr>
+          <w:b/>
+          <w:bCs/>
+          <w:i/>
+          <w:iCs/>
+        </w:rPr>
+        <w:t>net.core</w:t>
+      </w:r>
+      <w:proofErr w:type="gramEnd"/>
+      <w:r>
+        <w:rPr>
+          <w:b/>
+          <w:bCs/>
+          <w:i/>
+          <w:iCs/>
+        </w:rPr>
+        <w:t>.netdev_max_backlog</w:t>
+      </w:r>
+      <w:proofErr w:type="spellEnd"/>
+      <w:r>
+        <w:rPr>
+          <w:b/>
+          <w:bCs/>
+          <w:i/>
+          <w:iCs/>
+        </w:rPr>
+        <w:t xml:space="preserve"> = 3000’ &gt;&gt; /</w:t>
+      </w:r>
+      <w:proofErr w:type="spellStart"/>
+      <w:r>
+        <w:rPr>
+          <w:b/>
+          <w:bCs/>
+          <w:i/>
+          <w:iCs/>
+        </w:rPr>
+        <w:t>etc</w:t>
+      </w:r>
+      <w:proofErr w:type="spellEnd"/>
+      <w:r>
+        <w:rPr>
+          <w:b/>
+          <w:bCs/>
+          <w:i/>
+          <w:iCs/>
+        </w:rPr>
+        <w:t>/</w:t>
+      </w:r>
+      <w:proofErr w:type="spellStart"/>
+      <w:r>
+        <w:rPr>
+          <w:b/>
+          <w:bCs/>
+          <w:i/>
+          <w:iCs/>
+        </w:rPr>
+        <w:t>sysctl.conf</w:t>
+      </w:r>
+      <w:proofErr w:type="spellEnd"/>
+      <w:r>
+        <w:t xml:space="preserve"> (</w:t>
+      </w:r>
+      <w:r>
+        <w:t>one site recommends</w:t>
+      </w:r>
+      <w:r>
+        <w:t xml:space="preserve"> </w:t>
+      </w:r>
+      <w:r>
+        <w:t>setting it to 30000 from its default value of 1000; other sites recommend setting it to 2000).</w:t>
+      </w:r>
+      <w:r>
+        <w:t xml:space="preserve"> </w:t>
+      </w:r>
+    </w:p>
+    <w:p>
+      <w:r>
+        <w:rPr>
+          <w:b/>
+          <w:bCs/>
+        </w:rPr>
+        <w:t>UDP socket read buffer size:</w:t>
+      </w:r>
+      <w:r>
+        <w:t xml:space="preserve"> There is a pre-specified buffer for incoming data on each UDP socket, which can cause overflow when the client does not read fast enough to pull every packet before the next one arrives. This buffer size can be set using the </w:t>
+      </w:r>
+      <w:r>
+        <w:rPr>
+          <w:i/>
+          <w:iCs/>
+        </w:rPr>
+        <w:t>SO_RECVBUF</w:t>
+      </w:r>
+      <w:r>
+        <w:t xml:space="preserve"> socket option </w:t>
+      </w:r>
+      <w:r>
+        <w:t xml:space="preserve">using </w:t>
+      </w:r>
+      <w:proofErr w:type="spellStart"/>
+      <w:proofErr w:type="gramStart"/>
+      <w:r>
+        <w:rPr>
+          <w:i/>
+          <w:iCs/>
+        </w:rPr>
+        <w:t>setsockopt</w:t>
+      </w:r>
+      <w:proofErr w:type="spellEnd"/>
+      <w:r>
+        <w:rPr>
+          <w:i/>
+          <w:iCs/>
+        </w:rPr>
+        <w:t>(</w:t>
+      </w:r>
+      <w:proofErr w:type="gramEnd"/>
+      <w:r>
+        <w:rPr>
+          <w:i/>
+          <w:iCs/>
+        </w:rPr>
+        <w:t>)</w:t>
+      </w:r>
+      <w:r>
+        <w:t>. Setting it to be large enough to handle multiple incoming packets enables the system to be robust to longer periods between socket servicing.</w:t>
+      </w:r>
+    </w:p>
+    <w:p>
+      <w:r>
+        <w:rPr>
+          <w:b/>
+          <w:bCs/>
+        </w:rPr>
+        <w:t xml:space="preserve">UDP socket </w:t>
+      </w:r>
+      <w:proofErr w:type="gramStart"/>
+      <w:r>
+        <w:rPr>
+          <w:b/>
+          <w:bCs/>
+        </w:rPr>
+        <w:t>send</w:t>
+      </w:r>
+      <w:proofErr w:type="gramEnd"/>
+      <w:r>
+        <w:rPr>
+          <w:b/>
+          <w:bCs/>
+        </w:rPr>
+        <w:t xml:space="preserve"> buffer size:</w:t>
+      </w:r>
+      <w:r>
+        <w:t xml:space="preserve"> Controlled by </w:t>
+      </w:r>
+      <w:r>
+        <w:rPr>
+          <w:i/>
+          <w:iCs/>
+        </w:rPr>
+        <w:t>SO_SNDBUF</w:t>
+      </w:r>
+      <w:r>
+        <w:t xml:space="preserve"> option in </w:t>
+      </w:r>
+      <w:proofErr w:type="spellStart"/>
+      <w:proofErr w:type="gramStart"/>
+      <w:r>
+        <w:rPr>
+          <w:i/>
+          <w:iCs/>
+        </w:rPr>
+        <w:t>setsockopt</w:t>
+      </w:r>
+      <w:proofErr w:type="spellEnd"/>
+      <w:r>
+        <w:rPr>
+          <w:i/>
+          <w:iCs/>
+        </w:rPr>
+        <w:t>(</w:t>
+      </w:r>
+      <w:proofErr w:type="gramEnd"/>
+      <w:r>
+        <w:rPr>
+          <w:i/>
+          <w:iCs/>
+        </w:rPr>
+        <w:t>)</w:t>
+      </w:r>
+      <w:r>
+        <w:t>.</w:t>
+      </w:r>
+      <w:r>
+        <w:t xml:space="preserve"> This avoids packets being dropped before they are sent because the thread queues up a second one before the first has been transmitted.</w:t>
+      </w:r>
+    </w:p>
+    <w:p>
+      <w:r>
+        <w:rPr>
+          <w:b/>
+          <w:bCs/>
+        </w:rPr>
         <w:lastRenderedPageBreak/>
-        <w:t>Mellanox tuning:</w:t>
-      </w:r>
-      <w:r>
-        <w:t xml:space="preserve"> A set of tools for tuning Mellanox parameters is available here</w:t>
+        <w:t>Interrupt coalescence:</w:t>
+      </w:r>
+      <w:r>
+        <w:t xml:space="preserve"> </w:t>
+      </w:r>
+      <w:r>
+        <w:t xml:space="preserve">The </w:t>
+      </w:r>
+      <w:proofErr w:type="spellStart"/>
+      <w:r>
+        <w:rPr>
+          <w:b/>
+          <w:bCs/>
+          <w:i/>
+          <w:iCs/>
+        </w:rPr>
+        <w:t>ethtool</w:t>
+      </w:r>
+      <w:proofErr w:type="spellEnd"/>
+      <w:r>
+        <w:t xml:space="preserve"> command can be used to adjust the maximum time to wait and the maximum number of buffers to fill before generating an interrupt. When tested across a range of </w:t>
+      </w:r>
+      <w:proofErr w:type="spellStart"/>
+      <w:r>
+        <w:t>rx-usecs</w:t>
+      </w:r>
+      <w:proofErr w:type="spellEnd"/>
+      <w:r>
+        <w:t xml:space="preserve"> (8, 32, 128, 256) and a range of </w:t>
+      </w:r>
+      <w:proofErr w:type="spellStart"/>
+      <w:r>
+        <w:t>rx</w:t>
+      </w:r>
+      <w:proofErr w:type="spellEnd"/>
+      <w:r>
+        <w:t xml:space="preserve">-frames (16, 64, 128) there was not much difference in an application that </w:t>
+      </w:r>
+      <w:proofErr w:type="gramStart"/>
+      <w:r>
+        <w:t>was seeing</w:t>
+      </w:r>
+      <w:proofErr w:type="gramEnd"/>
+      <w:r>
+        <w:t xml:space="preserve"> a few lost frames on some cameras. The initial setting of 32, 64 was as good or better than the others in at least one of the two sweeps made of the parameters. It is likely that the Mellanox tuning set these parameters for high throughput when it was run.</w:t>
+      </w:r>
+      <w:r>
+        <w:t xml:space="preserve"> The </w:t>
+      </w:r>
+      <w:r>
+        <w:rPr>
+          <w:b/>
+          <w:bCs/>
+          <w:i/>
+          <w:iCs/>
+        </w:rPr>
+        <w:t>check_coalescing.sh</w:t>
+      </w:r>
+      <w:r>
+        <w:t xml:space="preserve"> script in the </w:t>
+      </w:r>
+      <w:proofErr w:type="spellStart"/>
+      <w:r>
+        <w:rPr>
+          <w:i/>
+          <w:iCs/>
+        </w:rPr>
+        <w:t>ASDP_Core_API</w:t>
+      </w:r>
+      <w:proofErr w:type="spellEnd"/>
+      <w:r>
+        <w:t xml:space="preserve"> library can be used to re-test this if needed.</w:t>
+      </w:r>
+    </w:p>
+    <w:p>
+      <w:r>
+        <w:rPr>
+          <w:b/>
+          <w:bCs/>
+        </w:rPr>
+        <w:t>Open Fabric:</w:t>
+      </w:r>
+      <w:r>
+        <w:t xml:space="preserve"> NVidia has a set of “open fabric” drivers that can provide a unified address space among 100GigE-connected hosts and their GPUs that handles virtual memory among all devices. If needed, this could be used for transferring data from the Storage Server to the Render Server.</w:t>
       </w:r>
       <w:r>
         <w:rPr>
           <w:rStyle w:val="FootnoteReference"/>
         </w:rPr>
-        <w:footnoteReference w:id="8"/>
-      </w:r>
-      <w:r>
-        <w:t xml:space="preserve">. This Mellanox git repository includes a python subdirectory that has a </w:t>
-      </w:r>
-      <w:r>
-        <w:rPr>
-          <w:b/>
-          <w:bCs/>
-          <w:i/>
-          <w:iCs/>
-        </w:rPr>
-        <w:t>mlnx_tune</w:t>
-      </w:r>
-      <w:r>
-        <w:t xml:space="preserve"> utility. When run as root, it configures the system for one of the specified profiles (use </w:t>
-      </w:r>
-      <w:r>
-        <w:rPr>
-          <w:b/>
-          <w:bCs/>
-          <w:i/>
-          <w:iCs/>
-        </w:rPr>
-        <w:t>sudo python3 mlnx_tune -h</w:t>
-      </w:r>
-      <w:r>
-        <w:t xml:space="preserve"> to get a list of the profiles. Two likely choices are HIGH_THROUGHPUT and </w:t>
-      </w:r>
-      <w:r>
-        <w:t>IP_FORWARDING_MULTI_STREAM_0_LOSS</w:t>
-      </w:r>
-      <w:r>
-        <w:t xml:space="preserve">. We </w:t>
-      </w:r>
-      <w:r>
-        <w:t>ran</w:t>
-      </w:r>
-      <w:r>
-        <w:t xml:space="preserve"> this command to configure HIGH_THROUGHPUT </w:t>
-      </w:r>
-      <w:r>
-        <w:t xml:space="preserve">on all systems where we were able </w:t>
-      </w:r>
-      <w:r>
-        <w:t xml:space="preserve">to get full-rate </w:t>
-      </w:r>
-      <w:r>
-        <w:t>receiving</w:t>
-      </w:r>
-      <w:r>
-        <w:t xml:space="preserve"> to work reliably: </w:t>
-      </w:r>
-      <w:r>
-        <w:rPr>
-          <w:b/>
-          <w:bCs/>
-          <w:i/>
-          <w:iCs/>
-        </w:rPr>
-        <w:t>sudo python3 mlnx_tune -p HIGH_THROUGHPUT</w:t>
-      </w:r>
-      <w:r>
+        <w:footnoteReference w:id="9"/>
+      </w:r>
+    </w:p>
+    <w:p>
+      <w:r>
+        <w:rPr>
+          <w:b/>
+          <w:bCs/>
+        </w:rPr>
+        <w:t>network_tuning.sh:</w:t>
+      </w:r>
+      <w:r>
+        <w:t xml:space="preserve"> This script lives in the </w:t>
+      </w:r>
+      <w:proofErr w:type="spellStart"/>
+      <w:r>
+        <w:t>ASDP_Core_API</w:t>
+      </w:r>
+      <w:proofErr w:type="spellEnd"/>
+      <w:r>
+        <w:t xml:space="preserve"> directory. It can be copied into /</w:t>
+      </w:r>
+      <w:proofErr w:type="spellStart"/>
+      <w:r>
+        <w:t>usr</w:t>
+      </w:r>
+      <w:proofErr w:type="spellEnd"/>
+      <w:r>
+        <w:t>/local/bin and made executable and then add the following to the file /</w:t>
+      </w:r>
+      <w:proofErr w:type="spellStart"/>
+      <w:r>
+        <w:t>etc</w:t>
+      </w:r>
+      <w:proofErr w:type="spellEnd"/>
+      <w:r>
+        <w:t>/system/system/</w:t>
+      </w:r>
+      <w:proofErr w:type="spellStart"/>
+      <w:r>
+        <w:t>network_tuning.service</w:t>
+      </w:r>
+      <w:proofErr w:type="spellEnd"/>
+      <w:r>
+        <w:t xml:space="preserve"> and then run </w:t>
+      </w:r>
+      <w:proofErr w:type="spellStart"/>
+      <w:r>
+        <w:rPr>
+          <w:b/>
+          <w:bCs/>
+          <w:i/>
+          <w:iCs/>
+        </w:rPr>
+        <w:t>sudo</w:t>
+      </w:r>
+      <w:proofErr w:type="spellEnd"/>
+      <w:r>
+        <w:rPr>
+          <w:b/>
+          <w:bCs/>
+          <w:i/>
+          <w:iCs/>
+        </w:rPr>
         <w:t xml:space="preserve"> </w:t>
       </w:r>
-      <w:r>
-        <w:t xml:space="preserve">so </w:t>
-      </w:r>
-      <w:r>
-        <w:t xml:space="preserve">it </w:t>
-      </w:r>
-      <w:r>
-        <w:t xml:space="preserve">may </w:t>
-      </w:r>
-      <w:r>
-        <w:t xml:space="preserve">be </w:t>
-      </w:r>
-      <w:r>
-        <w:t xml:space="preserve">required </w:t>
-      </w:r>
-      <w:r>
-        <w:t xml:space="preserve">once on each system and then </w:t>
-      </w:r>
-      <w:r>
-        <w:t>the system rebooted</w:t>
+      <w:proofErr w:type="spellStart"/>
+      <w:r>
+        <w:rPr>
+          <w:b/>
+          <w:bCs/>
+          <w:i/>
+          <w:iCs/>
+        </w:rPr>
+        <w:t>systemctl</w:t>
+      </w:r>
+      <w:proofErr w:type="spellEnd"/>
+      <w:r>
+        <w:rPr>
+          <w:b/>
+          <w:bCs/>
+          <w:i/>
+          <w:iCs/>
+        </w:rPr>
+        <w:t xml:space="preserve"> daemon-reload</w:t>
+      </w:r>
+      <w:r>
+        <w:t xml:space="preserve"> and</w:t>
+      </w:r>
+      <w:r>
+        <w:rPr>
+          <w:b/>
+          <w:bCs/>
+          <w:i/>
+          <w:iCs/>
+        </w:rPr>
+        <w:t xml:space="preserve"> </w:t>
+      </w:r>
+      <w:proofErr w:type="spellStart"/>
+      <w:r>
+        <w:rPr>
+          <w:b/>
+          <w:bCs/>
+          <w:i/>
+          <w:iCs/>
+        </w:rPr>
+        <w:t>sudo</w:t>
+      </w:r>
+      <w:proofErr w:type="spellEnd"/>
+      <w:r>
+        <w:rPr>
+          <w:b/>
+          <w:bCs/>
+          <w:i/>
+          <w:iCs/>
+        </w:rPr>
+        <w:t xml:space="preserve"> </w:t>
+      </w:r>
+      <w:proofErr w:type="spellStart"/>
+      <w:r>
+        <w:rPr>
+          <w:b/>
+          <w:bCs/>
+          <w:i/>
+          <w:iCs/>
+        </w:rPr>
+        <w:t>systemctl</w:t>
+      </w:r>
+      <w:proofErr w:type="spellEnd"/>
+      <w:r>
+        <w:rPr>
+          <w:b/>
+          <w:bCs/>
+          <w:i/>
+          <w:iCs/>
+        </w:rPr>
+        <w:t xml:space="preserve"> enable my-</w:t>
+      </w:r>
+      <w:proofErr w:type="spellStart"/>
+      <w:proofErr w:type="gramStart"/>
+      <w:r>
+        <w:rPr>
+          <w:b/>
+          <w:bCs/>
+          <w:i/>
+          <w:iCs/>
+        </w:rPr>
+        <w:t>startup.service</w:t>
+      </w:r>
+      <w:proofErr w:type="spellEnd"/>
+      <w:proofErr w:type="gramEnd"/>
+      <w:r>
+        <w:t xml:space="preserve"> </w:t>
+      </w:r>
+      <w:r>
+        <w:t>:</w:t>
+      </w:r>
+    </w:p>
+    <w:p>
+      <w:pPr>
+        <w:spacing w:after="0" w:line="240" w:lineRule="auto"/>
+        <w:rPr>
+          <w:rFonts w:ascii="Courier New" w:hAnsi="Courier New" w:cs="Courier New"/>
+        </w:rPr>
+      </w:pPr>
+      <w:r>
+        <w:rPr>
+          <w:rFonts w:ascii="Courier New" w:hAnsi="Courier New" w:cs="Courier New"/>
+        </w:rPr>
+        <w:t>[Unit]</w:t>
+      </w:r>
+    </w:p>
+    <w:p>
+      <w:pPr>
+        <w:spacing w:after="0" w:line="240" w:lineRule="auto"/>
+        <w:rPr>
+          <w:rFonts w:ascii="Courier New" w:hAnsi="Courier New" w:cs="Courier New"/>
+        </w:rPr>
+      </w:pPr>
+      <w:r>
+        <w:rPr>
+          <w:rFonts w:ascii="Courier New" w:hAnsi="Courier New" w:cs="Courier New"/>
+        </w:rPr>
+        <w:t>Description=ASDP Network Tuning</w:t>
+      </w:r>
+    </w:p>
+    <w:p>
+      <w:pPr>
+        <w:spacing w:after="0" w:line="240" w:lineRule="auto"/>
+        <w:rPr>
+          <w:rFonts w:ascii="Courier New" w:hAnsi="Courier New" w:cs="Courier New"/>
+        </w:rPr>
+      </w:pPr>
+      <w:r>
+        <w:rPr>
+          <w:rFonts w:ascii="Courier New" w:hAnsi="Courier New" w:cs="Courier New"/>
+        </w:rPr>
+        <w:t>Wants=</w:t>
+      </w:r>
+      <w:proofErr w:type="spellStart"/>
+      <w:r>
+        <w:rPr>
+          <w:rFonts w:ascii="Courier New" w:hAnsi="Courier New" w:cs="Courier New"/>
+        </w:rPr>
+        <w:t>network.target</w:t>
+      </w:r>
+      <w:proofErr w:type="spellEnd"/>
+    </w:p>
+    <w:p>
+      <w:pPr>
+        <w:spacing w:after="0" w:line="240" w:lineRule="auto"/>
+        <w:rPr>
+          <w:rFonts w:ascii="Courier New" w:hAnsi="Courier New" w:cs="Courier New"/>
+        </w:rPr>
+      </w:pPr>
+      <w:r>
+        <w:rPr>
+          <w:rFonts w:ascii="Courier New" w:hAnsi="Courier New" w:cs="Courier New"/>
+        </w:rPr>
+        <w:t>After=</w:t>
+      </w:r>
+      <w:proofErr w:type="spellStart"/>
+      <w:r>
+        <w:rPr>
+          <w:rFonts w:ascii="Courier New" w:hAnsi="Courier New" w:cs="Courier New"/>
+        </w:rPr>
+        <w:t>network.target</w:t>
+      </w:r>
+      <w:proofErr w:type="spellEnd"/>
+    </w:p>
+    <w:p>
+      <w:pPr>
+        <w:spacing w:after="0" w:line="240" w:lineRule="auto"/>
+        <w:rPr>
+          <w:rFonts w:ascii="Courier New" w:hAnsi="Courier New" w:cs="Courier New"/>
+        </w:rPr>
+      </w:pPr>
+    </w:p>
+    <w:p>
+      <w:pPr>
+        <w:spacing w:after="0" w:line="240" w:lineRule="auto"/>
+        <w:rPr>
+          <w:rFonts w:ascii="Courier New" w:hAnsi="Courier New" w:cs="Courier New"/>
+        </w:rPr>
+      </w:pPr>
+      <w:r>
+        <w:rPr>
+          <w:rFonts w:ascii="Courier New" w:hAnsi="Courier New" w:cs="Courier New"/>
+        </w:rPr>
+        <w:t>[Service]</w:t>
+      </w:r>
+    </w:p>
+    <w:p>
+      <w:pPr>
+        <w:spacing w:after="0" w:line="240" w:lineRule="auto"/>
+        <w:rPr>
+          <w:rFonts w:ascii="Courier New" w:hAnsi="Courier New" w:cs="Courier New"/>
+        </w:rPr>
+      </w:pPr>
+      <w:r>
+        <w:rPr>
+          <w:rFonts w:ascii="Courier New" w:hAnsi="Courier New" w:cs="Courier New"/>
+        </w:rPr>
+        <w:t>ExecStart=/usr/local/bin/network_tuning.sh</w:t>
+      </w:r>
+    </w:p>
+    <w:p>
+      <w:pPr>
+        <w:spacing w:after="0" w:line="240" w:lineRule="auto"/>
+        <w:rPr>
+          <w:rFonts w:ascii="Courier New" w:hAnsi="Courier New" w:cs="Courier New"/>
+        </w:rPr>
+      </w:pPr>
+      <w:r>
+        <w:rPr>
+          <w:rFonts w:ascii="Courier New" w:hAnsi="Courier New" w:cs="Courier New"/>
+        </w:rPr>
+        <w:t>Type=</w:t>
+      </w:r>
+      <w:proofErr w:type="spellStart"/>
+      <w:r>
+        <w:rPr>
+          <w:rFonts w:ascii="Courier New" w:hAnsi="Courier New" w:cs="Courier New"/>
+        </w:rPr>
+        <w:t>oneshot</w:t>
+      </w:r>
+      <w:proofErr w:type="spellEnd"/>
+    </w:p>
+    <w:p>
+      <w:pPr>
+        <w:spacing w:after="0" w:line="240" w:lineRule="auto"/>
+        <w:rPr>
+          <w:rFonts w:ascii="Courier New" w:hAnsi="Courier New" w:cs="Courier New"/>
+        </w:rPr>
+      </w:pPr>
+      <w:proofErr w:type="spellStart"/>
+      <w:proofErr w:type="gramStart"/>
+      <w:r>
+        <w:rPr>
+          <w:rFonts w:ascii="Courier New" w:hAnsi="Courier New" w:cs="Courier New"/>
+        </w:rPr>
+        <w:t>RemainAfterExit</w:t>
+      </w:r>
+      <w:proofErr w:type="spellEnd"/>
+      <w:proofErr w:type="gramEnd"/>
+      <w:r>
+        <w:rPr>
+          <w:rFonts w:ascii="Courier New" w:hAnsi="Courier New" w:cs="Courier New"/>
+        </w:rPr>
+        <w:t>=yes</w:t>
+      </w:r>
+    </w:p>
+    <w:p>
+      <w:pPr>
+        <w:spacing w:after="0" w:line="240" w:lineRule="auto"/>
+        <w:rPr>
+          <w:rFonts w:ascii="Courier New" w:hAnsi="Courier New" w:cs="Courier New"/>
+        </w:rPr>
+      </w:pPr>
+    </w:p>
+    <w:p>
+      <w:pPr>
+        <w:spacing w:after="0" w:line="240" w:lineRule="auto"/>
+        <w:rPr>
+          <w:rFonts w:ascii="Courier New" w:hAnsi="Courier New" w:cs="Courier New"/>
+        </w:rPr>
+      </w:pPr>
+      <w:r>
+        <w:rPr>
+          <w:rFonts w:ascii="Courier New" w:hAnsi="Courier New" w:cs="Courier New"/>
+        </w:rPr>
+        <w:t>[Install]</w:t>
+      </w:r>
+    </w:p>
+    <w:p>
+      <w:pPr>
+        <w:spacing w:after="0" w:line="240" w:lineRule="auto"/>
+        <w:rPr>
+          <w:rFonts w:ascii="Courier New" w:hAnsi="Courier New" w:cs="Courier New"/>
+        </w:rPr>
+      </w:pPr>
+      <w:proofErr w:type="spellStart"/>
+      <w:r>
+        <w:rPr>
+          <w:rFonts w:ascii="Courier New" w:hAnsi="Courier New" w:cs="Courier New"/>
+        </w:rPr>
+        <w:t>WantedBy</w:t>
+      </w:r>
+      <w:proofErr w:type="spellEnd"/>
+      <w:r>
+        <w:rPr>
+          <w:rFonts w:ascii="Courier New" w:hAnsi="Courier New" w:cs="Courier New"/>
+        </w:rPr>
+        <w:t>=multi-</w:t>
+      </w:r>
+      <w:proofErr w:type="spellStart"/>
+      <w:proofErr w:type="gramStart"/>
+      <w:r>
+        <w:rPr>
+          <w:rFonts w:ascii="Courier New" w:hAnsi="Courier New" w:cs="Courier New"/>
+        </w:rPr>
+        <w:t>user.target</w:t>
+      </w:r>
+      <w:proofErr w:type="spellEnd"/>
+      <w:proofErr w:type="gramEnd"/>
+    </w:p>
+    <w:p>
+      <w:pPr>
+        <w:pStyle w:val="Heading1"/>
+      </w:pPr>
+      <w:r>
+        <w:t>Buffer copy</w:t>
+      </w:r>
+      <w:r>
+        <w:t xml:space="preserve"> tuning</w:t>
+      </w:r>
+    </w:p>
+    <w:p>
+      <w:r>
+        <w:rPr>
+          <w:b/>
+          <w:bCs/>
+        </w:rPr>
+        <w:t>Pre-allocation:</w:t>
+      </w:r>
+      <w:r>
+        <w:t xml:space="preserve"> </w:t>
+      </w:r>
+      <w:r>
+        <w:t xml:space="preserve">In situations where there is the need to pass large buffers from one thread to another (network read to disk write, for example), consider using a pool of available vectors that is pre-allocated before the program starts to be able to cover the expected load (additional ones can be allocated at run time if needed). The producer can then mark </w:t>
+      </w:r>
+      <w:proofErr w:type="gramStart"/>
+      <w:r>
+        <w:t>these are</w:t>
+      </w:r>
+      <w:proofErr w:type="gramEnd"/>
+      <w:r>
+        <w:t xml:space="preserve"> being used and the consumer can mark them as being available. This avoids the need to copy from a just-read buffer into one that will be passed to the consumer; the producer can write directly into an available buffer and pass it without </w:t>
+      </w:r>
+      <w:proofErr w:type="gramStart"/>
+      <w:r>
+        <w:t>copying</w:t>
+      </w:r>
+      <w:proofErr w:type="gramEnd"/>
+      <w:r>
+        <w:t xml:space="preserve"> to the consumer.</w:t>
+      </w:r>
+      <w:r>
+        <w:t xml:space="preserve"> This allocation and handling the free buffer recycling can be </w:t>
+      </w:r>
+      <w:r>
+        <w:t xml:space="preserve">done </w:t>
+      </w:r>
+      <w:r>
+        <w:t xml:space="preserve">in a </w:t>
+      </w:r>
+      <w:r>
+        <w:t xml:space="preserve">buffer-allocator </w:t>
+      </w:r>
+      <w:r>
+        <w:t>class</w:t>
+      </w:r>
+      <w:r>
+        <w:t xml:space="preserve"> that is used by both the producer and consumer</w:t>
       </w:r>
       <w:r>
         <w:t>.</w:t>
@@ -2627,579 +4523,31 @@
           <w:b/>
           <w:bCs/>
         </w:rPr>
-        <w:t>Global receive buffer size:</w:t>
-      </w:r>
-      <w:r>
-        <w:t xml:space="preserve"> There is a system-wide number of available buffers. Using </w:t>
-      </w:r>
-      <w:r>
-        <w:rPr>
-          <w:b/>
-          <w:bCs/>
-          <w:i/>
-          <w:iCs/>
-        </w:rPr>
-        <w:t>sudo s</w:t>
-      </w:r>
-      <w:r>
-        <w:rPr>
-          <w:b/>
-          <w:bCs/>
-          <w:i/>
-          <w:iCs/>
-        </w:rPr>
-        <w:t>ysctl -w net.core.rmem_max=26214400</w:t>
-      </w:r>
-      <w:r>
-        <w:t xml:space="preserve"> (25MB) on the client enabled 25-camera (5 sending threads) operation at 125fps for 180 seconds without dropped packets.</w:t>
-      </w:r>
-    </w:p>
-    <w:p>
-      <w:pPr>
-        <w:rPr>
-          <w:b/>
-          <w:bCs/>
-          <w:i/>
-          <w:iCs/>
-        </w:rPr>
-      </w:pPr>
-      <w:r>
-        <w:rPr>
-          <w:b/>
-          <w:bCs/>
-        </w:rPr>
-        <w:t>Global UDP buffer pool size:</w:t>
-      </w:r>
-      <w:r>
-        <w:t xml:space="preserve"> There is also an operating-specified limit on the total number of pages available for UDP buffers. On Linux, the net.ipv4.udp_mem (readable via </w:t>
-      </w:r>
-      <w:r>
-        <w:rPr>
-          <w:i/>
-          <w:iCs/>
-        </w:rPr>
-        <w:t>/proc/sys/net/ipv4/udp_mem</w:t>
-      </w:r>
-      <w:r>
-        <w:t xml:space="preserve">) sets the number of 4K blocks available system wide. This can be adjusted using </w:t>
-      </w:r>
-      <w:r>
-        <w:rPr>
-          <w:i/>
-          <w:iCs/>
-        </w:rPr>
-        <w:t>sysctl</w:t>
-      </w:r>
-      <w:r>
-        <w:t xml:space="preserve"> and is set by default based on the total RAM size at boot time. When reaching 125fps without dropped packets, this was set on Linux using: </w:t>
-      </w:r>
-      <w:r>
-        <w:rPr>
-          <w:b/>
-          <w:bCs/>
-          <w:i/>
-          <w:iCs/>
-        </w:rPr>
-        <w:t>sudo sysctl -w net.ipv4.udp_mem=4000000</w:t>
-      </w:r>
-    </w:p>
-    <w:p>
-      <w:r>
-        <w:rPr>
-          <w:b/>
-          <w:bCs/>
-        </w:rPr>
-        <w:t>Global max backlog:</w:t>
-      </w:r>
-      <w:r>
-        <w:t xml:space="preserve"> This was not needed to achieve full throughput in our systems, but it is recommended for high-throughput systems:</w:t>
-      </w:r>
-      <w:r>
-        <w:t xml:space="preserve"> </w:t>
-      </w:r>
-      <w:r>
-        <w:rPr>
-          <w:b/>
-          <w:bCs/>
-          <w:i/>
-          <w:iCs/>
-        </w:rPr>
-        <w:t>sysctl -w net.core.netdev_max_backlog=</w:t>
-      </w:r>
-      <w:r>
-        <w:rPr>
-          <w:b/>
-          <w:bCs/>
-          <w:i/>
-          <w:iCs/>
-        </w:rPr>
-        <w:t>3</w:t>
-      </w:r>
-      <w:r>
-        <w:rPr>
-          <w:b/>
-          <w:bCs/>
-          <w:i/>
-          <w:iCs/>
-        </w:rPr>
-        <w:t>000</w:t>
-      </w:r>
-      <w:r>
-        <w:t xml:space="preserve"> </w:t>
-      </w:r>
-      <w:r>
-        <w:t xml:space="preserve">or to make it permanent: </w:t>
-      </w:r>
-      <w:r>
-        <w:rPr>
-          <w:b/>
-          <w:bCs/>
-          <w:i/>
-          <w:iCs/>
-        </w:rPr>
-        <w:t>echo ‘</w:t>
-      </w:r>
-      <w:r>
-        <w:rPr>
-          <w:b/>
-          <w:bCs/>
-          <w:i/>
-          <w:iCs/>
-        </w:rPr>
-        <w:t>net.core.netdev_max_backlog = 3000’ &gt;&gt; /etc/sysctl.conf</w:t>
-      </w:r>
-      <w:r>
-        <w:t xml:space="preserve"> (</w:t>
-      </w:r>
-      <w:r>
-        <w:t>one site recommends</w:t>
-      </w:r>
-      <w:r>
-        <w:t xml:space="preserve"> </w:t>
-      </w:r>
-      <w:r>
-        <w:t>setting it to 30000 from its default value of 1000; other sites recommend setting it to 2000).</w:t>
-      </w:r>
-      <w:r>
-        <w:t xml:space="preserve"> </w:t>
-      </w:r>
-    </w:p>
-    <w:p>
-      <w:r>
-        <w:rPr>
-          <w:b/>
-          <w:bCs/>
-        </w:rPr>
-        <w:t>UDP socket read buffer size:</w:t>
-      </w:r>
-      <w:r>
-        <w:t xml:space="preserve"> There is a pre-specified buffer for incoming data on each UDP socket, which can cause overflow when the client does not read fast enough to pull every packet before the next one arrives. This buffer size can be set using the </w:t>
-      </w:r>
-      <w:r>
-        <w:rPr>
-          <w:i/>
-          <w:iCs/>
-        </w:rPr>
-        <w:t>SO_RECVBUF</w:t>
-      </w:r>
-      <w:r>
-        <w:t xml:space="preserve"> socket option </w:t>
-      </w:r>
-      <w:r>
-        <w:t xml:space="preserve">using </w:t>
-      </w:r>
-      <w:r>
-        <w:rPr>
-          <w:i/>
-          <w:iCs/>
-        </w:rPr>
-        <w:t>setsockopt()</w:t>
-      </w:r>
-      <w:r>
-        <w:t>. Setting it to be large enough to handle multiple incoming packets enables the system to be robust to longer periods between socket servicing.</w:t>
-      </w:r>
-    </w:p>
-    <w:p>
-      <w:r>
-        <w:rPr>
-          <w:b/>
-          <w:bCs/>
-        </w:rPr>
-        <w:t>UDP socket send buffer size:</w:t>
-      </w:r>
-      <w:r>
-        <w:t xml:space="preserve"> Controlled by </w:t>
-      </w:r>
-      <w:r>
-        <w:rPr>
-          <w:i/>
-          <w:iCs/>
-        </w:rPr>
-        <w:t>SO_SNDBUF</w:t>
-      </w:r>
-      <w:r>
-        <w:t xml:space="preserve"> option in </w:t>
-      </w:r>
-      <w:r>
-        <w:rPr>
-          <w:i/>
-          <w:iCs/>
-        </w:rPr>
-        <w:t>setsockopt()</w:t>
-      </w:r>
-      <w:r>
-        <w:t>.</w:t>
-      </w:r>
-      <w:r>
-        <w:t xml:space="preserve"> This avoids packets being dropped before they are sent because the thread queues up a second one before the first has been transmitted.</w:t>
-      </w:r>
-    </w:p>
-    <w:p>
-      <w:r>
-        <w:rPr>
-          <w:b/>
-          <w:bCs/>
-        </w:rPr>
-        <w:t>Interrupt coalescence:</w:t>
-      </w:r>
-      <w:r>
-        <w:t xml:space="preserve"> </w:t>
-      </w:r>
-      <w:r>
-        <w:t xml:space="preserve">The </w:t>
-      </w:r>
-      <w:r>
-        <w:rPr>
-          <w:b/>
-          <w:bCs/>
-          <w:i/>
-          <w:iCs/>
-        </w:rPr>
-        <w:t>ethtool</w:t>
-      </w:r>
-      <w:r>
-        <w:t xml:space="preserve"> command can be used to adjust the maximum time to wait and the maximum number of buffers to fill before generating an interrupt. When tested across a range of rx-usecs (8, 32, 128, 256) and a range of rx-frames (16, 64, 128) there was not much difference in an application that was seeing a few lost frames on some cameras. The initial setting of 32, 64 was as good or better than the others in at least one of the two sweeps made of the parameters. It is likely that the Mellanox tuning set these parameters for high throughput when it was run.</w:t>
-      </w:r>
-      <w:r>
-        <w:t xml:space="preserve"> The </w:t>
-      </w:r>
-      <w:r>
-        <w:rPr>
-          <w:b/>
-          <w:bCs/>
-          <w:i/>
-          <w:iCs/>
-        </w:rPr>
-        <w:t>check_coalescing.sh</w:t>
-      </w:r>
-      <w:r>
-        <w:t xml:space="preserve"> script in the </w:t>
-      </w:r>
-      <w:r>
-        <w:rPr>
-          <w:i/>
-          <w:iCs/>
-        </w:rPr>
-        <w:t>ASDP_Core_API</w:t>
-      </w:r>
-      <w:r>
-        <w:t xml:space="preserve"> library can be used to re-test this if needed.</w:t>
-      </w:r>
-    </w:p>
-    <w:p>
-      <w:r>
-        <w:rPr>
-          <w:b/>
-          <w:bCs/>
-        </w:rPr>
-        <w:t>Open Fabric:</w:t>
-      </w:r>
-      <w:r>
-        <w:t xml:space="preserve"> NVidia has a set of “open fabric” drivers that can provide a unified address space among 100GigE-connected hosts and their GPUs that handles virtual memory among all devices. If needed, this could be used for transferring data from the Storage Server to the Render Server.</w:t>
-      </w:r>
-      <w:r>
-        <w:rPr>
-          <w:rStyle w:val="FootnoteReference"/>
-        </w:rPr>
-        <w:footnoteReference w:id="9"/>
-      </w:r>
-    </w:p>
-    <w:p>
-      <w:r>
-        <w:rPr>
-          <w:b/>
-          <w:bCs/>
-        </w:rPr>
-        <w:t>network_tuning.sh:</w:t>
-      </w:r>
-      <w:r>
-        <w:t xml:space="preserve"> This script lives in the ASDP_Core_API directory. It can be copied into /usr/local/bin and made executable and then add the following to the file /etc/system/system/network_tuning.service</w:t>
-      </w:r>
-      <w:r>
-        <w:t xml:space="preserve"> and then run </w:t>
-      </w:r>
-      <w:r>
-        <w:rPr>
-          <w:b/>
-          <w:bCs/>
-          <w:i/>
-          <w:iCs/>
-        </w:rPr>
-        <w:t>sudo systemctl daemon-reload</w:t>
-      </w:r>
-      <w:r>
-        <w:t xml:space="preserve"> and</w:t>
-      </w:r>
-      <w:r>
-        <w:rPr>
-          <w:b/>
-          <w:bCs/>
-          <w:i/>
-          <w:iCs/>
-        </w:rPr>
-        <w:t xml:space="preserve"> sudo systemctl enable my-startup.service</w:t>
-      </w:r>
-      <w:r>
-        <w:t xml:space="preserve"> </w:t>
-      </w:r>
-      <w:r>
-        <w:t>:</w:t>
-      </w:r>
-    </w:p>
-    <w:p>
-      <w:pPr>
-        <w:spacing w:after="0" w:line="240" w:lineRule="auto"/>
-        <w:rPr>
-          <w:rFonts w:ascii="Courier New" w:hAnsi="Courier New" w:cs="Courier New"/>
-        </w:rPr>
-      </w:pPr>
-      <w:r>
-        <w:rPr>
-          <w:rFonts w:ascii="Courier New" w:hAnsi="Courier New" w:cs="Courier New"/>
-        </w:rPr>
-        <w:t>[Unit]</w:t>
-      </w:r>
-    </w:p>
-    <w:p>
-      <w:pPr>
-        <w:spacing w:after="0" w:line="240" w:lineRule="auto"/>
-        <w:rPr>
-          <w:rFonts w:ascii="Courier New" w:hAnsi="Courier New" w:cs="Courier New"/>
-        </w:rPr>
-      </w:pPr>
-      <w:r>
-        <w:rPr>
-          <w:rFonts w:ascii="Courier New" w:hAnsi="Courier New" w:cs="Courier New"/>
-        </w:rPr>
-        <w:t>Description=ASDP Network Tuning</w:t>
-      </w:r>
-    </w:p>
-    <w:p>
-      <w:pPr>
-        <w:spacing w:after="0" w:line="240" w:lineRule="auto"/>
-        <w:rPr>
-          <w:rFonts w:ascii="Courier New" w:hAnsi="Courier New" w:cs="Courier New"/>
-        </w:rPr>
-      </w:pPr>
-      <w:r>
-        <w:rPr>
-          <w:rFonts w:ascii="Courier New" w:hAnsi="Courier New" w:cs="Courier New"/>
-        </w:rPr>
-        <w:t>Wants=network.target</w:t>
-      </w:r>
-    </w:p>
-    <w:p>
-      <w:pPr>
-        <w:spacing w:after="0" w:line="240" w:lineRule="auto"/>
-        <w:rPr>
-          <w:rFonts w:ascii="Courier New" w:hAnsi="Courier New" w:cs="Courier New"/>
-        </w:rPr>
-      </w:pPr>
-      <w:r>
-        <w:rPr>
-          <w:rFonts w:ascii="Courier New" w:hAnsi="Courier New" w:cs="Courier New"/>
-        </w:rPr>
-        <w:t>After=network.target</w:t>
-      </w:r>
-    </w:p>
-    <w:p>
-      <w:pPr>
-        <w:spacing w:after="0" w:line="240" w:lineRule="auto"/>
-        <w:rPr>
-          <w:rFonts w:ascii="Courier New" w:hAnsi="Courier New" w:cs="Courier New"/>
-        </w:rPr>
-      </w:pPr>
-    </w:p>
-    <w:p>
-      <w:pPr>
-        <w:spacing w:after="0" w:line="240" w:lineRule="auto"/>
-        <w:rPr>
-          <w:rFonts w:ascii="Courier New" w:hAnsi="Courier New" w:cs="Courier New"/>
-        </w:rPr>
-      </w:pPr>
-      <w:r>
-        <w:rPr>
-          <w:rFonts w:ascii="Courier New" w:hAnsi="Courier New" w:cs="Courier New"/>
+        <w:t>Spin-free queues:</w:t>
+      </w:r>
+      <w:r>
+        <w:t xml:space="preserve"> When passing buffers from one thread to another to be sent to disk, network, or GPU it is helpful for neither the sender to have to spin waiting to queue (or waiting for the queue to drain to a specified level) nor the receiver needing to spin waiting for new elements in the queue. A helper class that uses condition variables to support waiting for queues to be empty enough or full enough without spin-waiting.</w:t>
+      </w:r>
+    </w:p>
+    <w:p>
+      <w:r>
+        <w:rPr>
+          <w:b/>
+          <w:bCs/>
+        </w:rPr>
+        <w:t>GPU sends:</w:t>
+      </w:r>
+      <w:r>
+        <w:t xml:space="preserve"> To reduce the overhead of sending data to the GPU, network data packets are accumulated in batches and then sent to the asynchronous copy and then kernel run. On Linux, a batch size of 16 (48 lines) is sufficient. Windows requires a batch size of greater than 64 for 21 cameras and more like 300 for 25 cameras. To minimize the size of the last-sent batch, the value of 110 packets (330 lines) will be used – this will send at 330, 660, and 990 and leave a small batch for the last one, reducing latency. For 25 cameras, 330 packets (990 lines) will be sent in the first and then the small remainder in the second.</w:t>
+      </w:r>
+    </w:p>
+    <w:p>
+      <w:r>
+        <w:rPr>
+          <w:b/>
+          <w:bCs/>
         </w:rPr>
         <w:lastRenderedPageBreak/>
-        <w:t>[Service]</w:t>
-      </w:r>
-    </w:p>
-    <w:p>
-      <w:pPr>
-        <w:spacing w:after="0" w:line="240" w:lineRule="auto"/>
-        <w:rPr>
-          <w:rFonts w:ascii="Courier New" w:hAnsi="Courier New" w:cs="Courier New"/>
-        </w:rPr>
-      </w:pPr>
-      <w:r>
-        <w:rPr>
-          <w:rFonts w:ascii="Courier New" w:hAnsi="Courier New" w:cs="Courier New"/>
-        </w:rPr>
-        <w:t>ExecStart=/usr/local/bin/network_tuning.sh</w:t>
-      </w:r>
-    </w:p>
-    <w:p>
-      <w:pPr>
-        <w:spacing w:after="0" w:line="240" w:lineRule="auto"/>
-        <w:rPr>
-          <w:rFonts w:ascii="Courier New" w:hAnsi="Courier New" w:cs="Courier New"/>
-        </w:rPr>
-      </w:pPr>
-      <w:r>
-        <w:rPr>
-          <w:rFonts w:ascii="Courier New" w:hAnsi="Courier New" w:cs="Courier New"/>
-        </w:rPr>
-        <w:t>Type=oneshot</w:t>
-      </w:r>
-    </w:p>
-    <w:p>
-      <w:pPr>
-        <w:spacing w:after="0" w:line="240" w:lineRule="auto"/>
-        <w:rPr>
-          <w:rFonts w:ascii="Courier New" w:hAnsi="Courier New" w:cs="Courier New"/>
-        </w:rPr>
-      </w:pPr>
-      <w:r>
-        <w:rPr>
-          <w:rFonts w:ascii="Courier New" w:hAnsi="Courier New" w:cs="Courier New"/>
-        </w:rPr>
-        <w:t>RemainAfterExit=yes</w:t>
-      </w:r>
-    </w:p>
-    <w:p>
-      <w:pPr>
-        <w:spacing w:after="0" w:line="240" w:lineRule="auto"/>
-        <w:rPr>
-          <w:rFonts w:ascii="Courier New" w:hAnsi="Courier New" w:cs="Courier New"/>
-        </w:rPr>
-      </w:pPr>
-    </w:p>
-    <w:p>
-      <w:pPr>
-        <w:spacing w:after="0" w:line="240" w:lineRule="auto"/>
-        <w:rPr>
-          <w:rFonts w:ascii="Courier New" w:hAnsi="Courier New" w:cs="Courier New"/>
-        </w:rPr>
-      </w:pPr>
-      <w:r>
-        <w:rPr>
-          <w:rFonts w:ascii="Courier New" w:hAnsi="Courier New" w:cs="Courier New"/>
-        </w:rPr>
-        <w:t>[Install]</w:t>
-      </w:r>
-    </w:p>
-    <w:p>
-      <w:pPr>
-        <w:spacing w:after="0" w:line="240" w:lineRule="auto"/>
-        <w:rPr>
-          <w:rFonts w:ascii="Courier New" w:hAnsi="Courier New" w:cs="Courier New"/>
-        </w:rPr>
-      </w:pPr>
-      <w:r>
-        <w:rPr>
-          <w:rFonts w:ascii="Courier New" w:hAnsi="Courier New" w:cs="Courier New"/>
-        </w:rPr>
-        <w:t>WantedBy=multi-user.target</w:t>
-      </w:r>
-    </w:p>
-    <w:p>
-      <w:pPr>
-        <w:pStyle w:val="Heading1"/>
-      </w:pPr>
-      <w:r>
-        <w:t>Buffer copy</w:t>
-      </w:r>
-      <w:r>
-        <w:t xml:space="preserve"> tuning</w:t>
-      </w:r>
-    </w:p>
-    <w:p>
-      <w:r>
-        <w:rPr>
-          <w:b/>
-          <w:bCs/>
-        </w:rPr>
-        <w:t>Pre-allocation:</w:t>
-      </w:r>
-      <w:r>
-        <w:t xml:space="preserve"> </w:t>
-      </w:r>
-      <w:r>
-        <w:t>In situations where there is the need to pass large buffers from one thread to another (network read to disk write, for example), consider using a pool of available vectors that is pre-allocated before the program starts to be able to cover the expected load (additional ones can be allocated at run time if needed). The producer can then mark these are being used and the consumer can mark them as being available. This avoids the need to copy from a just-read buffer into one that will be passed to the consumer; the producer can write directly into an available buffer and pass it without copying to the consumer.</w:t>
-      </w:r>
-      <w:r>
-        <w:t xml:space="preserve"> This allocation and handling the free buffer recycling can be </w:t>
-      </w:r>
-      <w:r>
-        <w:t xml:space="preserve">done </w:t>
-      </w:r>
-      <w:r>
-        <w:t xml:space="preserve">in a </w:t>
-      </w:r>
-      <w:r>
-        <w:t xml:space="preserve">buffer-allocator </w:t>
-      </w:r>
-      <w:r>
-        <w:t>class</w:t>
-      </w:r>
-      <w:r>
-        <w:t xml:space="preserve"> that is used by both the producer and consumer</w:t>
-      </w:r>
-      <w:r>
-        <w:t>.</w:t>
-      </w:r>
-    </w:p>
-    <w:p>
-      <w:r>
-        <w:rPr>
-          <w:b/>
-          <w:bCs/>
-        </w:rPr>
-        <w:t>Spin-free queues:</w:t>
-      </w:r>
-      <w:r>
-        <w:t xml:space="preserve"> When passing buffers from one thread to another to be sent to disk, network, or GPU it is helpful for neither the sender to have to spin waiting to queue (or waiting for the queue to drain to a specified level) nor the receiver needing to spin waiting for new elements in the queue. A helper class that uses condition variables to support waiting for queues to be empty enough or full enough without spin-waiting.</w:t>
-      </w:r>
-    </w:p>
-    <w:p>
-      <w:r>
-        <w:rPr>
-          <w:b/>
-          <w:bCs/>
-        </w:rPr>
-        <w:t>GPU sends:</w:t>
-      </w:r>
-      <w:r>
-        <w:t xml:space="preserve"> To reduce the overhead of sending data to the GPU, network data packets are accumulated in batches and then sent to the asynchronous copy and then kernel run. On Linux, a batch size of 16 (48 lines) is sufficient. Windows requires a batch size of greater than 64 for 21 cameras and more like 300 for 25 cameras. To minimize the size of the last-sent batch, the value of 110 packets (330 lines) will be used – this will send at 330, 660, and 990 and leave a small batch for the last one, reducing latency. For 25 cameras, 330 packets (990 lines) will be sent in the first and then the small remainder in the second.</w:t>
-      </w:r>
-    </w:p>
-    <w:p>
-      <w:r>
-        <w:rPr>
-          <w:b/>
-          <w:bCs/>
-        </w:rPr>
         <w:t>GPU threads:</w:t>
       </w:r>
       <w:r>
@@ -3224,14 +4572,25 @@
       <w:r>
         <w:t xml:space="preserve">When a new kernel is built under Linux (after </w:t>
       </w:r>
-      <w:r>
-        <w:rPr>
-          <w:b/>
-          <w:bCs/>
-          <w:i/>
-          <w:iCs/>
-        </w:rPr>
-        <w:t>sudo apt upgrade</w:t>
+      <w:proofErr w:type="spellStart"/>
+      <w:r>
+        <w:rPr>
+          <w:b/>
+          <w:bCs/>
+          <w:i/>
+          <w:iCs/>
+        </w:rPr>
+        <w:t>sudo</w:t>
+      </w:r>
+      <w:proofErr w:type="spellEnd"/>
+      <w:r>
+        <w:rPr>
+          <w:b/>
+          <w:bCs/>
+          <w:i/>
+          <w:iCs/>
+        </w:rPr>
+        <w:t xml:space="preserve"> apt upgrade</w:t>
       </w:r>
       <w:r>
         <w:t xml:space="preserve">, for example), </w:t>
@@ -3255,7 +4614,15 @@
         <w:t>the script that installs the drivers fails when there is more than one kernel installed</w:t>
       </w:r>
       <w:r>
-        <w:t>. To avoid a failure to boot during this time, do the following:</w:t>
+        <w:t xml:space="preserve">. To </w:t>
+      </w:r>
+      <w:proofErr w:type="gramStart"/>
+      <w:r>
+        <w:t>avoid a failure</w:t>
+      </w:r>
+      <w:proofErr w:type="gramEnd"/>
+      <w:r>
+        <w:t xml:space="preserve"> to boot during this time, do the following:</w:t>
       </w:r>
     </w:p>
     <w:p>
@@ -3280,7 +4647,23 @@
           <w:i/>
           <w:iCs/>
         </w:rPr>
-        <w:t>/mnt/</w:t>
+        <w:t>/</w:t>
+      </w:r>
+      <w:proofErr w:type="spellStart"/>
+      <w:r>
+        <w:rPr>
+          <w:i/>
+          <w:iCs/>
+        </w:rPr>
+        <w:t>mnt</w:t>
+      </w:r>
+      <w:proofErr w:type="spellEnd"/>
+      <w:r>
+        <w:rPr>
+          <w:i/>
+          <w:iCs/>
+        </w:rPr>
+        <w:t>/</w:t>
       </w:r>
       <w:r>
         <w:rPr>
@@ -3297,8 +4680,33 @@
           <w:b/>
           <w:bCs/>
         </w:rPr>
-        <w:t>/etc/fstab</w:t>
-      </w:r>
+        <w:t>/</w:t>
+      </w:r>
+      <w:proofErr w:type="spellStart"/>
+      <w:r>
+        <w:rPr>
+          <w:b/>
+          <w:bCs/>
+        </w:rPr>
+        <w:t>etc</w:t>
+      </w:r>
+      <w:proofErr w:type="spellEnd"/>
+      <w:r>
+        <w:rPr>
+          <w:b/>
+          <w:bCs/>
+        </w:rPr>
+        <w:t>/</w:t>
+      </w:r>
+      <w:proofErr w:type="spellStart"/>
+      <w:r>
+        <w:rPr>
+          <w:b/>
+          <w:bCs/>
+        </w:rPr>
+        <w:t>fstab</w:t>
+      </w:r>
+      <w:proofErr w:type="spellEnd"/>
       <w:r>
         <w:t xml:space="preserve"> </w:t>
       </w:r>
@@ -3332,14 +4740,25 @@
       <w:r>
         <w:t xml:space="preserve">Remove the older kernel packages using </w:t>
       </w:r>
-      <w:r>
-        <w:rPr>
-          <w:b/>
-          <w:bCs/>
-          <w:i/>
-          <w:iCs/>
-        </w:rPr>
-        <w:t>sudo apt purge</w:t>
+      <w:proofErr w:type="spellStart"/>
+      <w:r>
+        <w:rPr>
+          <w:b/>
+          <w:bCs/>
+          <w:i/>
+          <w:iCs/>
+        </w:rPr>
+        <w:t>sudo</w:t>
+      </w:r>
+      <w:proofErr w:type="spellEnd"/>
+      <w:r>
+        <w:rPr>
+          <w:b/>
+          <w:bCs/>
+          <w:i/>
+          <w:iCs/>
+        </w:rPr>
+        <w:t xml:space="preserve"> apt purge</w:t>
       </w:r>
       <w:r>
         <w:t>, getting the headers, image, modules, and modules-extra packages.</w:t>
@@ -3356,15 +4775,77 @@
       <w:r>
         <w:t xml:space="preserve">Uninstall the previous drivers using </w:t>
       </w:r>
-      <w:r>
-        <w:rPr>
-          <w:b/>
-          <w:bCs/>
-          <w:i/>
-          <w:iCs/>
-        </w:rPr>
-        <w:t>sudo /usr/sbin/hptuninhptnvme</w:t>
-      </w:r>
+      <w:proofErr w:type="spellStart"/>
+      <w:r>
+        <w:rPr>
+          <w:b/>
+          <w:bCs/>
+          <w:i/>
+          <w:iCs/>
+        </w:rPr>
+        <w:t>sudo</w:t>
+      </w:r>
+      <w:proofErr w:type="spellEnd"/>
+      <w:r>
+        <w:rPr>
+          <w:b/>
+          <w:bCs/>
+          <w:i/>
+          <w:iCs/>
+        </w:rPr>
+        <w:t xml:space="preserve"> /</w:t>
+      </w:r>
+      <w:proofErr w:type="spellStart"/>
+      <w:r>
+        <w:rPr>
+          <w:b/>
+          <w:bCs/>
+          <w:i/>
+          <w:iCs/>
+        </w:rPr>
+        <w:t>usr</w:t>
+      </w:r>
+      <w:proofErr w:type="spellEnd"/>
+      <w:r>
+        <w:rPr>
+          <w:b/>
+          <w:bCs/>
+          <w:i/>
+          <w:iCs/>
+        </w:rPr>
+        <w:t>/</w:t>
+      </w:r>
+      <w:proofErr w:type="spellStart"/>
+      <w:r>
+        <w:rPr>
+          <w:b/>
+          <w:bCs/>
+          <w:i/>
+          <w:iCs/>
+        </w:rPr>
+        <w:t>sbin</w:t>
+      </w:r>
+      <w:proofErr w:type="spellEnd"/>
+      <w:r>
+        <w:rPr>
+          <w:b/>
+          <w:bCs/>
+          <w:i/>
+          <w:iCs/>
+        </w:rPr>
+        <w:t>/</w:t>
+      </w:r>
+      <w:proofErr w:type="spellStart"/>
+      <w:r>
+        <w:rPr>
+          <w:b/>
+          <w:bCs/>
+          <w:i/>
+          <w:iCs/>
+        </w:rPr>
+        <w:t>hptuninhptnvme</w:t>
+      </w:r>
+      <w:proofErr w:type="spellEnd"/>
     </w:p>
     <w:p>
       <w:pPr>
@@ -3380,14 +4861,25 @@
       <w:r>
         <w:t xml:space="preserve"> the system using </w:t>
       </w:r>
-      <w:r>
-        <w:rPr>
-          <w:b/>
-          <w:bCs/>
-          <w:i/>
-          <w:iCs/>
-        </w:rPr>
-        <w:t>sudo reboot</w:t>
+      <w:proofErr w:type="spellStart"/>
+      <w:r>
+        <w:rPr>
+          <w:b/>
+          <w:bCs/>
+          <w:i/>
+          <w:iCs/>
+        </w:rPr>
+        <w:t>sudo</w:t>
+      </w:r>
+      <w:proofErr w:type="spellEnd"/>
+      <w:r>
+        <w:rPr>
+          <w:b/>
+          <w:bCs/>
+          <w:i/>
+          <w:iCs/>
+        </w:rPr>
+        <w:t xml:space="preserve"> reboot</w:t>
       </w:r>
     </w:p>
     <w:p>
@@ -3399,7 +4891,15 @@
         </w:numPr>
       </w:pPr>
       <w:r>
-        <w:t>Install the drivers from the executable in the jmott home directory:</w:t>
+        <w:t xml:space="preserve">Install the drivers from the executable in the </w:t>
+      </w:r>
+      <w:proofErr w:type="spellStart"/>
+      <w:r>
+        <w:t>jmott</w:t>
+      </w:r>
+      <w:proofErr w:type="spellEnd"/>
+      <w:r>
+        <w:t xml:space="preserve"> home directory:</w:t>
       </w:r>
     </w:p>
     <w:p>
@@ -3410,14 +4910,25 @@
           <w:numId w:val="6"/>
         </w:numPr>
       </w:pPr>
-      <w:r>
-        <w:rPr>
-          <w:b/>
-          <w:bCs/>
-          <w:i/>
-          <w:iCs/>
-        </w:rPr>
-        <w:t xml:space="preserve">sudo </w:t>
+      <w:proofErr w:type="spellStart"/>
+      <w:r>
+        <w:rPr>
+          <w:b/>
+          <w:bCs/>
+          <w:i/>
+          <w:iCs/>
+        </w:rPr>
+        <w:t>sudo</w:t>
+      </w:r>
+      <w:proofErr w:type="spellEnd"/>
+      <w:r>
+        <w:rPr>
+          <w:b/>
+          <w:bCs/>
+          <w:i/>
+          <w:iCs/>
+        </w:rPr>
+        <w:t xml:space="preserve"> </w:t>
       </w:r>
       <w:r>
         <w:rPr>
@@ -3443,14 +4954,25 @@
       <w:r>
         <w:t xml:space="preserve"> the system using </w:t>
       </w:r>
-      <w:r>
-        <w:rPr>
-          <w:b/>
-          <w:bCs/>
-          <w:i/>
-          <w:iCs/>
-        </w:rPr>
-        <w:t>sudo reboot</w:t>
+      <w:proofErr w:type="spellStart"/>
+      <w:r>
+        <w:rPr>
+          <w:b/>
+          <w:bCs/>
+          <w:i/>
+          <w:iCs/>
+        </w:rPr>
+        <w:t>sudo</w:t>
+      </w:r>
+      <w:proofErr w:type="spellEnd"/>
+      <w:r>
+        <w:rPr>
+          <w:b/>
+          <w:bCs/>
+          <w:i/>
+          <w:iCs/>
+        </w:rPr>
+        <w:t xml:space="preserve"> reboot</w:t>
       </w:r>
     </w:p>
     <w:p>
@@ -3479,7 +5001,15 @@
         <w:t>hptblock0n0p</w:t>
       </w:r>
       <w:r>
-        <w:t xml:space="preserve"> exists: </w:t>
+        <w:t xml:space="preserve"> </w:t>
+      </w:r>
+      <w:proofErr w:type="gramStart"/>
+      <w:r>
+        <w:t>exists:</w:t>
+      </w:r>
+      <w:proofErr w:type="gramEnd"/>
+      <w:r>
+        <w:t xml:space="preserve"> </w:t>
       </w:r>
       <w:r>
         <w:rPr>
@@ -3516,7 +5046,23 @@
           <w:i/>
           <w:iCs/>
         </w:rPr>
-        <w:t>/mnt/</w:t>
+        <w:t>/</w:t>
+      </w:r>
+      <w:proofErr w:type="spellStart"/>
+      <w:r>
+        <w:rPr>
+          <w:i/>
+          <w:iCs/>
+        </w:rPr>
+        <w:t>mnt</w:t>
+      </w:r>
+      <w:proofErr w:type="spellEnd"/>
+      <w:r>
+        <w:rPr>
+          <w:i/>
+          <w:iCs/>
+        </w:rPr>
+        <w:t>/</w:t>
       </w:r>
       <w:r>
         <w:rPr>
@@ -3533,8 +5079,33 @@
           <w:b/>
           <w:bCs/>
         </w:rPr>
-        <w:t>/etc/fstab</w:t>
-      </w:r>
+        <w:t>/</w:t>
+      </w:r>
+      <w:proofErr w:type="spellStart"/>
+      <w:r>
+        <w:rPr>
+          <w:b/>
+          <w:bCs/>
+        </w:rPr>
+        <w:t>etc</w:t>
+      </w:r>
+      <w:proofErr w:type="spellEnd"/>
+      <w:r>
+        <w:rPr>
+          <w:b/>
+          <w:bCs/>
+        </w:rPr>
+        <w:t>/</w:t>
+      </w:r>
+      <w:proofErr w:type="spellStart"/>
+      <w:r>
+        <w:rPr>
+          <w:b/>
+          <w:bCs/>
+        </w:rPr>
+        <w:t>fstab</w:t>
+      </w:r>
+      <w:proofErr w:type="spellEnd"/>
     </w:p>
     <w:p>
       <w:pPr>
@@ -3547,14 +5118,45 @@
       <w:r>
         <w:t xml:space="preserve">Test mounting the drive using </w:t>
       </w:r>
-      <w:r>
-        <w:rPr>
-          <w:b/>
-          <w:bCs/>
-          <w:i/>
-          <w:iCs/>
-        </w:rPr>
-        <w:t>sudo mount /mnt/</w:t>
+      <w:proofErr w:type="spellStart"/>
+      <w:r>
+        <w:rPr>
+          <w:b/>
+          <w:bCs/>
+          <w:i/>
+          <w:iCs/>
+        </w:rPr>
+        <w:t>sudo</w:t>
+      </w:r>
+      <w:proofErr w:type="spellEnd"/>
+      <w:r>
+        <w:rPr>
+          <w:b/>
+          <w:bCs/>
+          <w:i/>
+          <w:iCs/>
+        </w:rPr>
+        <w:t xml:space="preserve"> mount /</w:t>
+      </w:r>
+      <w:proofErr w:type="spellStart"/>
+      <w:r>
+        <w:rPr>
+          <w:b/>
+          <w:bCs/>
+          <w:i/>
+          <w:iCs/>
+        </w:rPr>
+        <w:t>mnt</w:t>
+      </w:r>
+      <w:proofErr w:type="spellEnd"/>
+      <w:r>
+        <w:rPr>
+          <w:b/>
+          <w:bCs/>
+          <w:i/>
+          <w:iCs/>
+        </w:rPr>
+        <w:t>/</w:t>
       </w:r>
       <w:r>
         <w:rPr>
@@ -3602,8 +5204,21 @@
           <w:numId w:val="9"/>
         </w:numPr>
       </w:pPr>
-      <w:r>
-        <w:t>sudo update-initramfs -u</w:t>
+      <w:proofErr w:type="spellStart"/>
+      <w:r>
+        <w:t>sudo</w:t>
+      </w:r>
+      <w:proofErr w:type="spellEnd"/>
+      <w:r>
+        <w:t xml:space="preserve"> update-</w:t>
+      </w:r>
+      <w:proofErr w:type="spellStart"/>
+      <w:r>
+        <w:t>initramfs</w:t>
+      </w:r>
+      <w:proofErr w:type="spellEnd"/>
+      <w:r>
+        <w:t xml:space="preserve"> -u</w:t>
       </w:r>
     </w:p>
     <w:p>
@@ -3614,8 +5229,13 @@
           <w:numId w:val="9"/>
         </w:numPr>
       </w:pPr>
-      <w:r>
-        <w:t>sudo reboot</w:t>
+      <w:proofErr w:type="spellStart"/>
+      <w:r>
+        <w:t>sudo</w:t>
+      </w:r>
+      <w:proofErr w:type="spellEnd"/>
+      <w:r>
+        <w:t xml:space="preserve"> reboot</w:t>
       </w:r>
     </w:p>
     <w:p>
@@ -3991,8 +5611,13 @@
     <w:pPr>
       <w:pStyle w:val="Header"/>
     </w:pPr>
+    <w:proofErr w:type="spellStart"/>
     <w:r>
-      <w:t>ReliaSolve Technical Report TR-</w:t>
+      <w:t>ReliaSolve</w:t>
+    </w:r>
+    <w:proofErr w:type="spellEnd"/>
+    <w:r>
+      <w:t xml:space="preserve"> Technical Report TR-</w:t>
     </w:r>
     <w:r>
       <w:t>01</w:t>
@@ -4007,7 +5632,7 @@
       <w:t>2</w:t>
     </w:r>
     <w:r>
-      <w:t>6</w:t>
+      <w:t>7</w:t>
     </w:r>
     <w:r>
       <w:tab/>
@@ -4022,7 +5647,7 @@
       <w:t>1</w:t>
     </w:r>
     <w:r>
-      <w:t>4</w:t>
+      <w:t>6</w:t>
     </w:r>
     <w:r>
       <w:t>/2026</w:t>
@@ -5023,7 +6648,7 @@
   <w:abstractNum w:abstractNumId="8" w15:restartNumberingAfterBreak="0">
     <w:nsid w:val="41FF0449"/>
     <w:multiLevelType w:val="hybridMultilevel"/>
-    <w:tmpl w:val="4AF02C6A"/>
+    <w:tmpl w:val="A80A212E"/>
     <w:lvl w:ilvl="0" w:tplc="04090001">
       <w:start w:val="1"/>
       <w:numFmt w:val="bullet"/>

</xml_diff>